<commit_message>
KnowledgeRep Assignment 1 checkpoint
</commit_message>
<xml_diff>
--- a/assignment1/A1_COMP9016_OReilly_Ruairi_R00065426.docx
+++ b/assignment1/A1_COMP9016_OReilly_Ruairi_R00065426.docx
@@ -26,6 +26,17 @@
     </w:p>
     <w:sdt>
       <w:sdtPr>
+        <w:rPr>
+          <w:rFonts w:asciiTheme="minorHAnsi" w:eastAsiaTheme="minorHAnsi" w:hAnsiTheme="minorHAnsi" w:cstheme="minorBidi"/>
+          <w:b w:val="0"/>
+          <w:bCs w:val="0"/>
+          <w:color w:val="auto"/>
+          <w:kern w:val="2"/>
+          <w:sz w:val="24"/>
+          <w:szCs w:val="24"/>
+          <w:lang w:val="en-IE"/>
+          <w14:ligatures w14:val="standardContextual"/>
+        </w:rPr>
         <w:id w:val="-1826819514"/>
         <w:docPartObj>
           <w:docPartGallery w:val="Table of Contents"/>
@@ -34,14 +45,11 @@
       </w:sdtPr>
       <w:sdtEndPr>
         <w:rPr>
-          <w:rFonts w:asciiTheme="minorHAnsi" w:eastAsiaTheme="minorHAnsi" w:hAnsiTheme="minorHAnsi" w:cstheme="minorBidi"/>
+          <w:rFonts w:ascii="Times New Roman" w:eastAsia="Times New Roman" w:hAnsi="Times New Roman" w:cs="Times New Roman"/>
           <w:noProof/>
-          <w:color w:val="auto"/>
-          <w:kern w:val="2"/>
-          <w:sz w:val="24"/>
-          <w:szCs w:val="24"/>
-          <w:lang w:val="en-IE"/>
-          <w14:ligatures w14:val="standardContextual"/>
+          <w:kern w:val="0"/>
+          <w:lang w:eastAsia="en-GB"/>
+          <w14:ligatures w14:val="none"/>
         </w:rPr>
       </w:sdtEndPr>
       <w:sdtContent>
@@ -60,7 +68,13 @@
               <w:tab w:val="right" w:leader="dot" w:pos="9016"/>
             </w:tabs>
             <w:rPr>
+              <w:rFonts w:eastAsiaTheme="minorEastAsia"/>
+              <w:b w:val="0"/>
+              <w:bCs w:val="0"/>
+              <w:i w:val="0"/>
+              <w:iCs w:val="0"/>
               <w:noProof/>
+              <w:lang w:eastAsia="en-GB"/>
             </w:rPr>
           </w:pPr>
           <w:r>
@@ -80,7 +94,7 @@
             </w:rPr>
             <w:fldChar w:fldCharType="separate"/>
           </w:r>
-          <w:hyperlink w:anchor="_Toc209879242" w:history="1">
+          <w:hyperlink w:anchor="_Toc209958853" w:history="1">
             <w:r>
               <w:rPr>
                 <w:rStyle w:val="Hyperlink"/>
@@ -107,7 +121,7 @@
                 <w:noProof/>
                 <w:webHidden/>
               </w:rPr>
-              <w:instrText xml:space="preserve"> PAGEREF _Toc209879242 \h </w:instrText>
+              <w:instrText xml:space="preserve"> PAGEREF _Toc209958853 \h </w:instrText>
             </w:r>
             <w:r>
               <w:rPr>
@@ -145,10 +159,16 @@
               <w:tab w:val="right" w:leader="dot" w:pos="9016"/>
             </w:tabs>
             <w:rPr>
+              <w:rFonts w:eastAsiaTheme="minorEastAsia"/>
+              <w:b w:val="0"/>
+              <w:bCs w:val="0"/>
               <w:noProof/>
+              <w:sz w:val="24"/>
+              <w:szCs w:val="24"/>
+              <w:lang w:eastAsia="en-GB"/>
             </w:rPr>
           </w:pPr>
-          <w:hyperlink w:anchor="_Toc209879243" w:history="1">
+          <w:hyperlink w:anchor="_Toc209958854" w:history="1">
             <w:r>
               <w:rPr>
                 <w:rStyle w:val="Hyperlink"/>
@@ -175,7 +195,7 @@
                 <w:noProof/>
                 <w:webHidden/>
               </w:rPr>
-              <w:instrText xml:space="preserve"> PAGEREF _Toc209879243 \h </w:instrText>
+              <w:instrText xml:space="preserve"> PAGEREF _Toc209958854 \h </w:instrText>
             </w:r>
             <w:r>
               <w:rPr>
@@ -213,10 +233,16 @@
               <w:tab w:val="right" w:leader="dot" w:pos="9016"/>
             </w:tabs>
             <w:rPr>
+              <w:rFonts w:eastAsiaTheme="minorEastAsia"/>
+              <w:b w:val="0"/>
+              <w:bCs w:val="0"/>
               <w:noProof/>
+              <w:sz w:val="24"/>
+              <w:szCs w:val="24"/>
+              <w:lang w:eastAsia="en-GB"/>
             </w:rPr>
           </w:pPr>
-          <w:hyperlink w:anchor="_Toc209879244" w:history="1">
+          <w:hyperlink w:anchor="_Toc209958855" w:history="1">
             <w:r>
               <w:rPr>
                 <w:rStyle w:val="Hyperlink"/>
@@ -243,7 +269,7 @@
                 <w:noProof/>
                 <w:webHidden/>
               </w:rPr>
-              <w:instrText xml:space="preserve"> PAGEREF _Toc209879244 \h </w:instrText>
+              <w:instrText xml:space="preserve"> PAGEREF _Toc209958855 \h </w:instrText>
             </w:r>
             <w:r>
               <w:rPr>
@@ -281,16 +307,20 @@
               <w:tab w:val="right" w:leader="dot" w:pos="9016"/>
             </w:tabs>
             <w:rPr>
+              <w:rFonts w:eastAsiaTheme="minorEastAsia"/>
               <w:noProof/>
+              <w:sz w:val="24"/>
+              <w:szCs w:val="24"/>
+              <w:lang w:eastAsia="en-GB"/>
             </w:rPr>
           </w:pPr>
-          <w:hyperlink w:anchor="_Toc209879245" w:history="1">
+          <w:hyperlink w:anchor="_Toc209958856" w:history="1">
             <w:r>
               <w:rPr>
                 <w:rStyle w:val="Hyperlink"/>
                 <w:noProof/>
               </w:rPr>
-              <w:t>Agent 1: Simple Reflex Agent</w:t>
+              <w:t>Agent 1: Random Agent</w:t>
             </w:r>
             <w:r>
               <w:rPr>
@@ -311,7 +341,7 @@
                 <w:noProof/>
                 <w:webHidden/>
               </w:rPr>
-              <w:instrText xml:space="preserve"> PAGEREF _Toc209879245 \h </w:instrText>
+              <w:instrText xml:space="preserve"> PAGEREF _Toc209958856 \h </w:instrText>
             </w:r>
             <w:r>
               <w:rPr>
@@ -349,16 +379,20 @@
               <w:tab w:val="right" w:leader="dot" w:pos="9016"/>
             </w:tabs>
             <w:rPr>
+              <w:rFonts w:eastAsiaTheme="minorEastAsia"/>
               <w:noProof/>
+              <w:sz w:val="24"/>
+              <w:szCs w:val="24"/>
+              <w:lang w:eastAsia="en-GB"/>
             </w:rPr>
           </w:pPr>
-          <w:hyperlink w:anchor="_Toc209879246" w:history="1">
+          <w:hyperlink w:anchor="_Toc209958857" w:history="1">
             <w:r>
               <w:rPr>
                 <w:rStyle w:val="Hyperlink"/>
                 <w:noProof/>
               </w:rPr>
-              <w:t>Agent 2: Model-Based Reflex Agent</w:t>
+              <w:t>Agent 2: Reflex Agent</w:t>
             </w:r>
             <w:r>
               <w:rPr>
@@ -379,7 +413,7 @@
                 <w:noProof/>
                 <w:webHidden/>
               </w:rPr>
-              <w:instrText xml:space="preserve"> PAGEREF _Toc209879246 \h </w:instrText>
+              <w:instrText xml:space="preserve"> PAGEREF _Toc209958857 \h </w:instrText>
             </w:r>
             <w:r>
               <w:rPr>
@@ -399,7 +433,7 @@
                 <w:noProof/>
                 <w:webHidden/>
               </w:rPr>
-              <w:t>2</w:t>
+              <w:t>3</w:t>
             </w:r>
             <w:r>
               <w:rPr>
@@ -417,16 +451,20 @@
               <w:tab w:val="right" w:leader="dot" w:pos="9016"/>
             </w:tabs>
             <w:rPr>
+              <w:rFonts w:eastAsiaTheme="minorEastAsia"/>
               <w:noProof/>
+              <w:sz w:val="24"/>
+              <w:szCs w:val="24"/>
+              <w:lang w:eastAsia="en-GB"/>
             </w:rPr>
           </w:pPr>
-          <w:hyperlink w:anchor="_Toc209879247" w:history="1">
+          <w:hyperlink w:anchor="_Toc209958858" w:history="1">
             <w:r>
               <w:rPr>
                 <w:rStyle w:val="Hyperlink"/>
                 <w:noProof/>
               </w:rPr>
-              <w:t>Agent 3: Goal-Based Agent</w:t>
+              <w:t>Agent 3: Model-Based Reflex Agent</w:t>
             </w:r>
             <w:r>
               <w:rPr>
@@ -447,7 +485,7 @@
                 <w:noProof/>
                 <w:webHidden/>
               </w:rPr>
-              <w:instrText xml:space="preserve"> PAGEREF _Toc209879247 \h </w:instrText>
+              <w:instrText xml:space="preserve"> PAGEREF _Toc209958858 \h </w:instrText>
             </w:r>
             <w:r>
               <w:rPr>
@@ -467,7 +505,7 @@
                 <w:noProof/>
                 <w:webHidden/>
               </w:rPr>
-              <w:t>2</w:t>
+              <w:t>3</w:t>
             </w:r>
             <w:r>
               <w:rPr>
@@ -485,10 +523,16 @@
               <w:tab w:val="right" w:leader="dot" w:pos="9016"/>
             </w:tabs>
             <w:rPr>
+              <w:rFonts w:eastAsiaTheme="minorEastAsia"/>
+              <w:b w:val="0"/>
+              <w:bCs w:val="0"/>
               <w:noProof/>
+              <w:sz w:val="24"/>
+              <w:szCs w:val="24"/>
+              <w:lang w:eastAsia="en-GB"/>
             </w:rPr>
           </w:pPr>
-          <w:hyperlink w:anchor="_Toc209879248" w:history="1">
+          <w:hyperlink w:anchor="_Toc209958859" w:history="1">
             <w:r>
               <w:rPr>
                 <w:rStyle w:val="Hyperlink"/>
@@ -515,7 +559,7 @@
                 <w:noProof/>
                 <w:webHidden/>
               </w:rPr>
-              <w:instrText xml:space="preserve"> PAGEREF _Toc209879248 \h </w:instrText>
+              <w:instrText xml:space="preserve"> PAGEREF _Toc209958859 \h </w:instrText>
             </w:r>
             <w:r>
               <w:rPr>
@@ -535,907 +579,7 @@
                 <w:noProof/>
                 <w:webHidden/>
               </w:rPr>
-              <w:t>2</w:t>
-            </w:r>
-            <w:r>
-              <w:rPr>
-                <w:noProof/>
-                <w:webHidden/>
-              </w:rPr>
-              <w:fldChar w:fldCharType="end"/>
-            </w:r>
-          </w:hyperlink>
-        </w:p>
-        <w:p>
-          <w:pPr>
-            <w:pStyle w:val="TOC1"/>
-            <w:tabs>
-              <w:tab w:val="right" w:leader="dot" w:pos="9016"/>
-            </w:tabs>
-            <w:rPr>
-              <w:noProof/>
-            </w:rPr>
-          </w:pPr>
-          <w:hyperlink w:anchor="_Toc209879249" w:history="1">
-            <w:r>
-              <w:rPr>
-                <w:rStyle w:val="Hyperlink"/>
-                <w:noProof/>
-              </w:rPr>
-              <w:t>1.2 Searching Your World (Search Techniques)</w:t>
-            </w:r>
-            <w:r>
-              <w:rPr>
-                <w:noProof/>
-                <w:webHidden/>
-              </w:rPr>
-              <w:tab/>
-            </w:r>
-            <w:r>
-              <w:rPr>
-                <w:noProof/>
-                <w:webHidden/>
-              </w:rPr>
-              <w:fldChar w:fldCharType="begin"/>
-            </w:r>
-            <w:r>
-              <w:rPr>
-                <w:noProof/>
-                <w:webHidden/>
-              </w:rPr>
-              <w:instrText xml:space="preserve"> PAGEREF _Toc209879249 \h </w:instrText>
-            </w:r>
-            <w:r>
-              <w:rPr>
-                <w:noProof/>
-                <w:webHidden/>
-              </w:rPr>
-            </w:r>
-            <w:r>
-              <w:rPr>
-                <w:noProof/>
-                <w:webHidden/>
-              </w:rPr>
-              <w:fldChar w:fldCharType="separate"/>
-            </w:r>
-            <w:r>
-              <w:rPr>
-                <w:noProof/>
-                <w:webHidden/>
-              </w:rPr>
-              <w:t>4</w:t>
-            </w:r>
-            <w:r>
-              <w:rPr>
-                <w:noProof/>
-                <w:webHidden/>
-              </w:rPr>
-              <w:fldChar w:fldCharType="end"/>
-            </w:r>
-          </w:hyperlink>
-        </w:p>
-        <w:p>
-          <w:pPr>
-            <w:pStyle w:val="TOC2"/>
-            <w:tabs>
-              <w:tab w:val="right" w:leader="dot" w:pos="9016"/>
-            </w:tabs>
-            <w:rPr>
-              <w:noProof/>
-            </w:rPr>
-          </w:pPr>
-          <w:hyperlink w:anchor="_Toc209879250" w:history="1">
-            <w:r>
-              <w:rPr>
-                <w:rStyle w:val="Hyperlink"/>
-                <w:noProof/>
-              </w:rPr>
-              <w:t>Problem Formulation</w:t>
-            </w:r>
-            <w:r>
-              <w:rPr>
-                <w:noProof/>
-                <w:webHidden/>
-              </w:rPr>
-              <w:tab/>
-            </w:r>
-            <w:r>
-              <w:rPr>
-                <w:noProof/>
-                <w:webHidden/>
-              </w:rPr>
-              <w:fldChar w:fldCharType="begin"/>
-            </w:r>
-            <w:r>
-              <w:rPr>
-                <w:noProof/>
-                <w:webHidden/>
-              </w:rPr>
-              <w:instrText xml:space="preserve"> PAGEREF _Toc209879250 \h </w:instrText>
-            </w:r>
-            <w:r>
-              <w:rPr>
-                <w:noProof/>
-                <w:webHidden/>
-              </w:rPr>
-            </w:r>
-            <w:r>
-              <w:rPr>
-                <w:noProof/>
-                <w:webHidden/>
-              </w:rPr>
-              <w:fldChar w:fldCharType="separate"/>
-            </w:r>
-            <w:r>
-              <w:rPr>
-                <w:noProof/>
-                <w:webHidden/>
-              </w:rPr>
-              <w:t>4</w:t>
-            </w:r>
-            <w:r>
-              <w:rPr>
-                <w:noProof/>
-                <w:webHidden/>
-              </w:rPr>
-              <w:fldChar w:fldCharType="end"/>
-            </w:r>
-          </w:hyperlink>
-        </w:p>
-        <w:p>
-          <w:pPr>
-            <w:pStyle w:val="TOC2"/>
-            <w:tabs>
-              <w:tab w:val="right" w:leader="dot" w:pos="9016"/>
-            </w:tabs>
-            <w:rPr>
-              <w:noProof/>
-            </w:rPr>
-          </w:pPr>
-          <w:hyperlink w:anchor="_Toc209879251" w:history="1">
-            <w:r>
-              <w:rPr>
-                <w:rStyle w:val="Hyperlink"/>
-                <w:noProof/>
-              </w:rPr>
-              <w:t>Uninformed Search Techniques</w:t>
-            </w:r>
-            <w:r>
-              <w:rPr>
-                <w:noProof/>
-                <w:webHidden/>
-              </w:rPr>
-              <w:tab/>
-            </w:r>
-            <w:r>
-              <w:rPr>
-                <w:noProof/>
-                <w:webHidden/>
-              </w:rPr>
-              <w:fldChar w:fldCharType="begin"/>
-            </w:r>
-            <w:r>
-              <w:rPr>
-                <w:noProof/>
-                <w:webHidden/>
-              </w:rPr>
-              <w:instrText xml:space="preserve"> PAGEREF _Toc209879251 \h </w:instrText>
-            </w:r>
-            <w:r>
-              <w:rPr>
-                <w:noProof/>
-                <w:webHidden/>
-              </w:rPr>
-            </w:r>
-            <w:r>
-              <w:rPr>
-                <w:noProof/>
-                <w:webHidden/>
-              </w:rPr>
-              <w:fldChar w:fldCharType="separate"/>
-            </w:r>
-            <w:r>
-              <w:rPr>
-                <w:noProof/>
-                <w:webHidden/>
-              </w:rPr>
-              <w:t>4</w:t>
-            </w:r>
-            <w:r>
-              <w:rPr>
-                <w:noProof/>
-                <w:webHidden/>
-              </w:rPr>
-              <w:fldChar w:fldCharType="end"/>
-            </w:r>
-          </w:hyperlink>
-        </w:p>
-        <w:p>
-          <w:pPr>
-            <w:pStyle w:val="TOC3"/>
-            <w:tabs>
-              <w:tab w:val="left" w:pos="960"/>
-              <w:tab w:val="right" w:leader="dot" w:pos="9016"/>
-            </w:tabs>
-            <w:rPr>
-              <w:noProof/>
-            </w:rPr>
-          </w:pPr>
-          <w:hyperlink w:anchor="_Toc209879252" w:history="1">
-            <w:r>
-              <w:rPr>
-                <w:rStyle w:val="Hyperlink"/>
-                <w:noProof/>
-              </w:rPr>
-              <w:t>1.</w:t>
-            </w:r>
-            <w:r>
-              <w:rPr>
-                <w:noProof/>
-              </w:rPr>
-              <w:tab/>
-            </w:r>
-            <w:r>
-              <w:rPr>
-                <w:rStyle w:val="Hyperlink"/>
-                <w:noProof/>
-              </w:rPr>
-              <w:t>Breadth-First Search (BFS)</w:t>
-            </w:r>
-            <w:r>
-              <w:rPr>
-                <w:noProof/>
-                <w:webHidden/>
-              </w:rPr>
-              <w:tab/>
-            </w:r>
-            <w:r>
-              <w:rPr>
-                <w:noProof/>
-                <w:webHidden/>
-              </w:rPr>
-              <w:fldChar w:fldCharType="begin"/>
-            </w:r>
-            <w:r>
-              <w:rPr>
-                <w:noProof/>
-                <w:webHidden/>
-              </w:rPr>
-              <w:instrText xml:space="preserve"> PAGEREF _Toc209879252 \h </w:instrText>
-            </w:r>
-            <w:r>
-              <w:rPr>
-                <w:noProof/>
-                <w:webHidden/>
-              </w:rPr>
-            </w:r>
-            <w:r>
-              <w:rPr>
-                <w:noProof/>
-                <w:webHidden/>
-              </w:rPr>
-              <w:fldChar w:fldCharType="separate"/>
-            </w:r>
-            <w:r>
-              <w:rPr>
-                <w:noProof/>
-                <w:webHidden/>
-              </w:rPr>
-              <w:t>4</w:t>
-            </w:r>
-            <w:r>
-              <w:rPr>
-                <w:noProof/>
-                <w:webHidden/>
-              </w:rPr>
-              <w:fldChar w:fldCharType="end"/>
-            </w:r>
-          </w:hyperlink>
-        </w:p>
-        <w:p>
-          <w:pPr>
-            <w:pStyle w:val="TOC3"/>
-            <w:tabs>
-              <w:tab w:val="left" w:pos="960"/>
-              <w:tab w:val="right" w:leader="dot" w:pos="9016"/>
-            </w:tabs>
-            <w:rPr>
-              <w:noProof/>
-            </w:rPr>
-          </w:pPr>
-          <w:hyperlink w:anchor="_Toc209879253" w:history="1">
-            <w:r>
-              <w:rPr>
-                <w:rStyle w:val="Hyperlink"/>
-                <w:noProof/>
-              </w:rPr>
-              <w:t>2.</w:t>
-            </w:r>
-            <w:r>
-              <w:rPr>
-                <w:noProof/>
-              </w:rPr>
-              <w:tab/>
-            </w:r>
-            <w:r>
-              <w:rPr>
-                <w:rStyle w:val="Hyperlink"/>
-                <w:noProof/>
-              </w:rPr>
-              <w:t>Uniform-Cost Search</w:t>
-            </w:r>
-            <w:r>
-              <w:rPr>
-                <w:noProof/>
-                <w:webHidden/>
-              </w:rPr>
-              <w:tab/>
-            </w:r>
-            <w:r>
-              <w:rPr>
-                <w:noProof/>
-                <w:webHidden/>
-              </w:rPr>
-              <w:fldChar w:fldCharType="begin"/>
-            </w:r>
-            <w:r>
-              <w:rPr>
-                <w:noProof/>
-                <w:webHidden/>
-              </w:rPr>
-              <w:instrText xml:space="preserve"> PAGEREF _Toc209879253 \h </w:instrText>
-            </w:r>
-            <w:r>
-              <w:rPr>
-                <w:noProof/>
-                <w:webHidden/>
-              </w:rPr>
-            </w:r>
-            <w:r>
-              <w:rPr>
-                <w:noProof/>
-                <w:webHidden/>
-              </w:rPr>
-              <w:fldChar w:fldCharType="separate"/>
-            </w:r>
-            <w:r>
-              <w:rPr>
-                <w:noProof/>
-                <w:webHidden/>
-              </w:rPr>
-              <w:t>4</w:t>
-            </w:r>
-            <w:r>
-              <w:rPr>
-                <w:noProof/>
-                <w:webHidden/>
-              </w:rPr>
-              <w:fldChar w:fldCharType="end"/>
-            </w:r>
-          </w:hyperlink>
-        </w:p>
-        <w:p>
-          <w:pPr>
-            <w:pStyle w:val="TOC3"/>
-            <w:tabs>
-              <w:tab w:val="left" w:pos="960"/>
-              <w:tab w:val="right" w:leader="dot" w:pos="9016"/>
-            </w:tabs>
-            <w:rPr>
-              <w:noProof/>
-            </w:rPr>
-          </w:pPr>
-          <w:hyperlink w:anchor="_Toc209879254" w:history="1">
-            <w:r>
-              <w:rPr>
-                <w:rStyle w:val="Hyperlink"/>
-                <w:noProof/>
-              </w:rPr>
-              <w:t>3.</w:t>
-            </w:r>
-            <w:r>
-              <w:rPr>
-                <w:noProof/>
-              </w:rPr>
-              <w:tab/>
-            </w:r>
-            <w:r>
-              <w:rPr>
-                <w:rStyle w:val="Hyperlink"/>
-                <w:noProof/>
-              </w:rPr>
-              <w:t>Depth-First Search (DFS)</w:t>
-            </w:r>
-            <w:r>
-              <w:rPr>
-                <w:noProof/>
-                <w:webHidden/>
-              </w:rPr>
-              <w:tab/>
-            </w:r>
-            <w:r>
-              <w:rPr>
-                <w:noProof/>
-                <w:webHidden/>
-              </w:rPr>
-              <w:fldChar w:fldCharType="begin"/>
-            </w:r>
-            <w:r>
-              <w:rPr>
-                <w:noProof/>
-                <w:webHidden/>
-              </w:rPr>
-              <w:instrText xml:space="preserve"> PAGEREF _Toc209879254 \h </w:instrText>
-            </w:r>
-            <w:r>
-              <w:rPr>
-                <w:noProof/>
-                <w:webHidden/>
-              </w:rPr>
-            </w:r>
-            <w:r>
-              <w:rPr>
-                <w:noProof/>
-                <w:webHidden/>
-              </w:rPr>
-              <w:fldChar w:fldCharType="separate"/>
-            </w:r>
-            <w:r>
-              <w:rPr>
-                <w:noProof/>
-                <w:webHidden/>
-              </w:rPr>
-              <w:t>4</w:t>
-            </w:r>
-            <w:r>
-              <w:rPr>
-                <w:noProof/>
-                <w:webHidden/>
-              </w:rPr>
-              <w:fldChar w:fldCharType="end"/>
-            </w:r>
-          </w:hyperlink>
-        </w:p>
-        <w:p>
-          <w:pPr>
-            <w:pStyle w:val="TOC2"/>
-            <w:tabs>
-              <w:tab w:val="right" w:leader="dot" w:pos="9016"/>
-            </w:tabs>
-            <w:rPr>
-              <w:noProof/>
-            </w:rPr>
-          </w:pPr>
-          <w:hyperlink w:anchor="_Toc209879255" w:history="1">
-            <w:r>
-              <w:rPr>
-                <w:rStyle w:val="Hyperlink"/>
-                <w:noProof/>
-              </w:rPr>
-              <w:t>Informed Search Techniques</w:t>
-            </w:r>
-            <w:r>
-              <w:rPr>
-                <w:noProof/>
-                <w:webHidden/>
-              </w:rPr>
-              <w:tab/>
-            </w:r>
-            <w:r>
-              <w:rPr>
-                <w:noProof/>
-                <w:webHidden/>
-              </w:rPr>
-              <w:fldChar w:fldCharType="begin"/>
-            </w:r>
-            <w:r>
-              <w:rPr>
-                <w:noProof/>
-                <w:webHidden/>
-              </w:rPr>
-              <w:instrText xml:space="preserve"> PAGEREF _Toc209879255 \h </w:instrText>
-            </w:r>
-            <w:r>
-              <w:rPr>
-                <w:noProof/>
-                <w:webHidden/>
-              </w:rPr>
-            </w:r>
-            <w:r>
-              <w:rPr>
-                <w:noProof/>
-                <w:webHidden/>
-              </w:rPr>
-              <w:fldChar w:fldCharType="separate"/>
-            </w:r>
-            <w:r>
-              <w:rPr>
-                <w:noProof/>
-                <w:webHidden/>
-              </w:rPr>
-              <w:t>4</w:t>
-            </w:r>
-            <w:r>
-              <w:rPr>
-                <w:noProof/>
-                <w:webHidden/>
-              </w:rPr>
-              <w:fldChar w:fldCharType="end"/>
-            </w:r>
-          </w:hyperlink>
-        </w:p>
-        <w:p>
-          <w:pPr>
-            <w:pStyle w:val="TOC3"/>
-            <w:tabs>
-              <w:tab w:val="left" w:pos="960"/>
-              <w:tab w:val="right" w:leader="dot" w:pos="9016"/>
-            </w:tabs>
-            <w:rPr>
-              <w:noProof/>
-            </w:rPr>
-          </w:pPr>
-          <w:hyperlink w:anchor="_Toc209879256" w:history="1">
-            <w:r>
-              <w:rPr>
-                <w:rStyle w:val="Hyperlink"/>
-                <w:noProof/>
-              </w:rPr>
-              <w:t>1.</w:t>
-            </w:r>
-            <w:r>
-              <w:rPr>
-                <w:noProof/>
-              </w:rPr>
-              <w:tab/>
-            </w:r>
-            <w:r>
-              <w:rPr>
-                <w:rStyle w:val="Hyperlink"/>
-                <w:noProof/>
-              </w:rPr>
-              <w:t>Greedy Best-First Search</w:t>
-            </w:r>
-            <w:r>
-              <w:rPr>
-                <w:noProof/>
-                <w:webHidden/>
-              </w:rPr>
-              <w:tab/>
-            </w:r>
-            <w:r>
-              <w:rPr>
-                <w:noProof/>
-                <w:webHidden/>
-              </w:rPr>
-              <w:fldChar w:fldCharType="begin"/>
-            </w:r>
-            <w:r>
-              <w:rPr>
-                <w:noProof/>
-                <w:webHidden/>
-              </w:rPr>
-              <w:instrText xml:space="preserve"> PAGEREF _Toc209879256 \h </w:instrText>
-            </w:r>
-            <w:r>
-              <w:rPr>
-                <w:noProof/>
-                <w:webHidden/>
-              </w:rPr>
-            </w:r>
-            <w:r>
-              <w:rPr>
-                <w:noProof/>
-                <w:webHidden/>
-              </w:rPr>
-              <w:fldChar w:fldCharType="separate"/>
-            </w:r>
-            <w:r>
-              <w:rPr>
-                <w:noProof/>
-                <w:webHidden/>
-              </w:rPr>
-              <w:t>4</w:t>
-            </w:r>
-            <w:r>
-              <w:rPr>
-                <w:noProof/>
-                <w:webHidden/>
-              </w:rPr>
-              <w:fldChar w:fldCharType="end"/>
-            </w:r>
-          </w:hyperlink>
-        </w:p>
-        <w:p>
-          <w:pPr>
-            <w:pStyle w:val="TOC3"/>
-            <w:tabs>
-              <w:tab w:val="left" w:pos="960"/>
-              <w:tab w:val="right" w:leader="dot" w:pos="9016"/>
-            </w:tabs>
-            <w:rPr>
-              <w:noProof/>
-            </w:rPr>
-          </w:pPr>
-          <w:hyperlink w:anchor="_Toc209879257" w:history="1">
-            <w:r>
-              <w:rPr>
-                <w:rStyle w:val="Hyperlink"/>
-                <w:noProof/>
-              </w:rPr>
-              <w:t>2.</w:t>
-            </w:r>
-            <w:r>
-              <w:rPr>
-                <w:noProof/>
-              </w:rPr>
-              <w:tab/>
-            </w:r>
-            <w:r>
-              <w:rPr>
-                <w:rStyle w:val="Hyperlink"/>
-                <w:noProof/>
-              </w:rPr>
-              <w:t>A Search*</w:t>
-            </w:r>
-            <w:r>
-              <w:rPr>
-                <w:noProof/>
-                <w:webHidden/>
-              </w:rPr>
-              <w:tab/>
-            </w:r>
-            <w:r>
-              <w:rPr>
-                <w:noProof/>
-                <w:webHidden/>
-              </w:rPr>
-              <w:fldChar w:fldCharType="begin"/>
-            </w:r>
-            <w:r>
-              <w:rPr>
-                <w:noProof/>
-                <w:webHidden/>
-              </w:rPr>
-              <w:instrText xml:space="preserve"> PAGEREF _Toc209879257 \h </w:instrText>
-            </w:r>
-            <w:r>
-              <w:rPr>
-                <w:noProof/>
-                <w:webHidden/>
-              </w:rPr>
-            </w:r>
-            <w:r>
-              <w:rPr>
-                <w:noProof/>
-                <w:webHidden/>
-              </w:rPr>
-              <w:fldChar w:fldCharType="separate"/>
-            </w:r>
-            <w:r>
-              <w:rPr>
-                <w:noProof/>
-                <w:webHidden/>
-              </w:rPr>
-              <w:t>4</w:t>
-            </w:r>
-            <w:r>
-              <w:rPr>
-                <w:noProof/>
-                <w:webHidden/>
-              </w:rPr>
-              <w:fldChar w:fldCharType="end"/>
-            </w:r>
-          </w:hyperlink>
-        </w:p>
-        <w:p>
-          <w:pPr>
-            <w:pStyle w:val="TOC3"/>
-            <w:tabs>
-              <w:tab w:val="left" w:pos="960"/>
-              <w:tab w:val="right" w:leader="dot" w:pos="9016"/>
-            </w:tabs>
-            <w:rPr>
-              <w:noProof/>
-            </w:rPr>
-          </w:pPr>
-          <w:hyperlink w:anchor="_Toc209879258" w:history="1">
-            <w:r>
-              <w:rPr>
-                <w:rStyle w:val="Hyperlink"/>
-                <w:noProof/>
-              </w:rPr>
-              <w:t>3.</w:t>
-            </w:r>
-            <w:r>
-              <w:rPr>
-                <w:noProof/>
-              </w:rPr>
-              <w:tab/>
-            </w:r>
-            <w:r>
-              <w:rPr>
-                <w:rStyle w:val="Hyperlink"/>
-                <w:noProof/>
-              </w:rPr>
-              <w:t>Iterative Deepening A*</w:t>
-            </w:r>
-            <w:r>
-              <w:rPr>
-                <w:noProof/>
-                <w:webHidden/>
-              </w:rPr>
-              <w:tab/>
-            </w:r>
-            <w:r>
-              <w:rPr>
-                <w:noProof/>
-                <w:webHidden/>
-              </w:rPr>
-              <w:fldChar w:fldCharType="begin"/>
-            </w:r>
-            <w:r>
-              <w:rPr>
-                <w:noProof/>
-                <w:webHidden/>
-              </w:rPr>
-              <w:instrText xml:space="preserve"> PAGEREF _Toc209879258 \h </w:instrText>
-            </w:r>
-            <w:r>
-              <w:rPr>
-                <w:noProof/>
-                <w:webHidden/>
-              </w:rPr>
-            </w:r>
-            <w:r>
-              <w:rPr>
-                <w:noProof/>
-                <w:webHidden/>
-              </w:rPr>
-              <w:fldChar w:fldCharType="separate"/>
-            </w:r>
-            <w:r>
-              <w:rPr>
-                <w:noProof/>
-                <w:webHidden/>
-              </w:rPr>
-              <w:t>4</w:t>
-            </w:r>
-            <w:r>
-              <w:rPr>
-                <w:noProof/>
-                <w:webHidden/>
-              </w:rPr>
-              <w:fldChar w:fldCharType="end"/>
-            </w:r>
-          </w:hyperlink>
-        </w:p>
-        <w:p>
-          <w:pPr>
-            <w:pStyle w:val="TOC2"/>
-            <w:tabs>
-              <w:tab w:val="right" w:leader="dot" w:pos="9016"/>
-            </w:tabs>
-            <w:rPr>
-              <w:noProof/>
-            </w:rPr>
-          </w:pPr>
-          <w:hyperlink w:anchor="_Toc209879259" w:history="1">
-            <w:r>
-              <w:rPr>
-                <w:rStyle w:val="Hyperlink"/>
-                <w:noProof/>
-              </w:rPr>
-              <w:t>Performance Evaluation</w:t>
-            </w:r>
-            <w:r>
-              <w:rPr>
-                <w:noProof/>
-                <w:webHidden/>
-              </w:rPr>
-              <w:tab/>
-            </w:r>
-            <w:r>
-              <w:rPr>
-                <w:noProof/>
-                <w:webHidden/>
-              </w:rPr>
-              <w:fldChar w:fldCharType="begin"/>
-            </w:r>
-            <w:r>
-              <w:rPr>
-                <w:noProof/>
-                <w:webHidden/>
-              </w:rPr>
-              <w:instrText xml:space="preserve"> PAGEREF _Toc209879259 \h </w:instrText>
-            </w:r>
-            <w:r>
-              <w:rPr>
-                <w:noProof/>
-                <w:webHidden/>
-              </w:rPr>
-            </w:r>
-            <w:r>
-              <w:rPr>
-                <w:noProof/>
-                <w:webHidden/>
-              </w:rPr>
-              <w:fldChar w:fldCharType="separate"/>
-            </w:r>
-            <w:r>
-              <w:rPr>
-                <w:noProof/>
-                <w:webHidden/>
-              </w:rPr>
-              <w:t>4</w:t>
-            </w:r>
-            <w:r>
-              <w:rPr>
-                <w:noProof/>
-                <w:webHidden/>
-              </w:rPr>
-              <w:fldChar w:fldCharType="end"/>
-            </w:r>
-          </w:hyperlink>
-        </w:p>
-        <w:p>
-          <w:pPr>
-            <w:pStyle w:val="TOC1"/>
-            <w:tabs>
-              <w:tab w:val="right" w:leader="dot" w:pos="9016"/>
-            </w:tabs>
-            <w:rPr>
-              <w:noProof/>
-            </w:rPr>
-          </w:pPr>
-          <w:hyperlink w:anchor="_Toc209879260" w:history="1">
-            <w:r>
-              <w:rPr>
-                <w:rStyle w:val="Hyperlink"/>
-                <w:noProof/>
-              </w:rPr>
-              <w:t>Conclusion</w:t>
-            </w:r>
-            <w:r>
-              <w:rPr>
-                <w:noProof/>
-                <w:webHidden/>
-              </w:rPr>
-              <w:tab/>
-            </w:r>
-            <w:r>
-              <w:rPr>
-                <w:noProof/>
-                <w:webHidden/>
-              </w:rPr>
-              <w:fldChar w:fldCharType="begin"/>
-            </w:r>
-            <w:r>
-              <w:rPr>
-                <w:noProof/>
-                <w:webHidden/>
-              </w:rPr>
-              <w:instrText xml:space="preserve"> PAGEREF _Toc209879260 \h </w:instrText>
-            </w:r>
-            <w:r>
-              <w:rPr>
-                <w:noProof/>
-                <w:webHidden/>
-              </w:rPr>
-            </w:r>
-            <w:r>
-              <w:rPr>
-                <w:noProof/>
-                <w:webHidden/>
-              </w:rPr>
-              <w:fldChar w:fldCharType="separate"/>
-            </w:r>
-            <w:r>
-              <w:rPr>
-                <w:noProof/>
-                <w:webHidden/>
-              </w:rPr>
-              <w:t>6</w:t>
+              <w:t>3</w:t>
             </w:r>
             <w:r>
               <w:rPr>
@@ -1475,7 +619,7 @@
       <w:pPr>
         <w:pStyle w:val="Heading1"/>
       </w:pPr>
-      <w:bookmarkStart w:id="0" w:name="_Toc209879242"/>
+      <w:bookmarkStart w:id="0" w:name="_Toc209958853"/>
       <w:r>
         <w:lastRenderedPageBreak/>
         <w:t>1.1 Building Your World</w:t>
@@ -1489,43 +633,437 @@
       <w:pPr>
         <w:pStyle w:val="Heading2"/>
       </w:pPr>
-      <w:bookmarkStart w:id="1" w:name="_Toc209879243"/>
+      <w:bookmarkStart w:id="1" w:name="_Toc209958854"/>
       <w:r>
         <w:t>Task Environment Description</w:t>
       </w:r>
       <w:bookmarkEnd w:id="1"/>
     </w:p>
     <w:p>
-      <w:pPr>
-        <w:numPr>
-          <w:ilvl w:val="0"/>
-          <w:numId w:val="2"/>
-        </w:numPr>
-      </w:pPr>
-      <w:r>
-        <w:t>Define the 2D world (grid-based, game-like environment)</w:t>
+      <w:r>
+        <w:t xml:space="preserve">The 2D world that has been implemented is a grid of configurable height and depth. </w:t>
       </w:r>
     </w:p>
     <w:p>
-      <w:pPr>
-        <w:numPr>
-          <w:ilvl w:val="0"/>
-          <w:numId w:val="2"/>
-        </w:numPr>
-      </w:pPr>
-      <w:r>
-        <w:t>Describe the mechanics: movement, goals, obstacles, rewards</w:t>
+      <w:r>
+        <w:t xml:space="preserve">There is one Winning block in the grid. If the agent lands on the Winning block, they are awarded 100 points, the game is declared Won, and the game is over. </w:t>
       </w:r>
     </w:p>
     <w:p>
-      <w:pPr>
-        <w:numPr>
-          <w:ilvl w:val="0"/>
-          <w:numId w:val="2"/>
-        </w:numPr>
-      </w:pPr>
-      <w:r>
-        <w:t>Completion conditions for the game</w:t>
+      <w:r>
+        <w:t xml:space="preserve">There is one Penalty block in the game. If the agent  lands on the penalty block, they are penalised 50 points. </w:t>
+      </w:r>
+    </w:p>
+    <w:p>
+      <w:r>
+        <w:t xml:space="preserve">There is one Obstacle block in the game </w:t>
+      </w:r>
+      <w:r>
+        <w:t xml:space="preserve">on to </w:t>
+      </w:r>
+      <w:r>
+        <w:t>which the agent cannot move.</w:t>
+      </w:r>
+    </w:p>
+    <w:p>
+      <w:r>
+        <w:t xml:space="preserve">The agent cannot move outside the boundaries of the grid. </w:t>
+      </w:r>
+    </w:p>
+    <w:p>
+      <w:r>
+        <w:t xml:space="preserve">They can move one square per move in any of </w:t>
+      </w:r>
+      <w:r>
+        <w:t>“</w:t>
+      </w:r>
+      <w:r>
+        <w:t>up</w:t>
+      </w:r>
+      <w:r>
+        <w:t>”</w:t>
+      </w:r>
+      <w:r>
+        <w:t xml:space="preserve">, </w:t>
+      </w:r>
+      <w:r>
+        <w:t>“</w:t>
+      </w:r>
+      <w:r>
+        <w:t>down</w:t>
+      </w:r>
+      <w:r>
+        <w:t>”</w:t>
+      </w:r>
+      <w:r>
+        <w:t xml:space="preserve">, </w:t>
+      </w:r>
+      <w:r>
+        <w:t>“</w:t>
+      </w:r>
+      <w:r>
+        <w:t>left</w:t>
+      </w:r>
+      <w:r>
+        <w:t>”</w:t>
+      </w:r>
+      <w:r>
+        <w:t xml:space="preserve"> or </w:t>
+      </w:r>
+      <w:r>
+        <w:t>“</w:t>
+      </w:r>
+      <w:r>
+        <w:t>right</w:t>
+      </w:r>
+      <w:r>
+        <w:t>”</w:t>
+      </w:r>
+      <w:r>
+        <w:t>, provided that the above restrictions are met</w:t>
+      </w:r>
+      <w:r>
+        <w:t>.</w:t>
+      </w:r>
+      <w:r>
+        <w:br/>
+      </w:r>
+    </w:p>
+    <w:p>
+      <w:pPr>
+        <w:shd w:val="clear" w:color="auto" w:fill="1F1F1F"/>
+        <w:spacing w:line="300" w:lineRule="atLeast"/>
+        <w:rPr>
+          <w:rFonts w:ascii="Hack" w:hAnsi="Hack"/>
+          <w:color w:val="CCCCCC"/>
+          <w:sz w:val="20"/>
+          <w:szCs w:val="20"/>
+        </w:rPr>
+      </w:pPr>
+      <w:r>
+        <w:rPr>
+          <w:rFonts w:ascii="Hack" w:hAnsi="Hack"/>
+          <w:color w:val="CE9178"/>
+          <w:sz w:val="20"/>
+          <w:szCs w:val="20"/>
+        </w:rPr>
+        <w:t># Here is an example map of the 2D world</w:t>
+      </w:r>
+    </w:p>
+    <w:p>
+      <w:pPr>
+        <w:shd w:val="clear" w:color="auto" w:fill="1F1F1F"/>
+        <w:spacing w:line="300" w:lineRule="atLeast"/>
+        <w:rPr>
+          <w:rFonts w:ascii="Hack" w:hAnsi="Hack"/>
+          <w:color w:val="CCCCCC"/>
+          <w:sz w:val="20"/>
+          <w:szCs w:val="20"/>
+        </w:rPr>
+      </w:pPr>
+      <w:r>
+        <w:rPr>
+          <w:rFonts w:ascii="Hack" w:hAnsi="Hack"/>
+          <w:color w:val="CE9178"/>
+          <w:sz w:val="20"/>
+          <w:szCs w:val="20"/>
+        </w:rPr>
+        <w:t># (width 4 by depth 3 grid, obstacle at (1, 1), penalty at (3, 1) and winning block at (3, 0))</w:t>
+      </w:r>
+    </w:p>
+    <w:p>
+      <w:pPr>
+        <w:shd w:val="clear" w:color="auto" w:fill="1F1F1F"/>
+        <w:spacing w:line="300" w:lineRule="atLeast"/>
+        <w:rPr>
+          <w:rFonts w:ascii="Hack" w:hAnsi="Hack"/>
+          <w:color w:val="CCCCCC"/>
+          <w:sz w:val="20"/>
+          <w:szCs w:val="20"/>
+        </w:rPr>
+      </w:pPr>
+      <w:r>
+        <w:rPr>
+          <w:rFonts w:ascii="Hack" w:hAnsi="Hack"/>
+          <w:color w:val="CE9178"/>
+          <w:sz w:val="20"/>
+          <w:szCs w:val="20"/>
+        </w:rPr>
+        <w:t>┌──────────┬──────────┬──────────┬──────────┐</w:t>
+      </w:r>
+    </w:p>
+    <w:p>
+      <w:pPr>
+        <w:shd w:val="clear" w:color="auto" w:fill="1F1F1F"/>
+        <w:spacing w:line="300" w:lineRule="atLeast"/>
+        <w:rPr>
+          <w:rFonts w:ascii="Hack" w:hAnsi="Hack"/>
+          <w:color w:val="CCCCCC"/>
+          <w:sz w:val="20"/>
+          <w:szCs w:val="20"/>
+        </w:rPr>
+      </w:pPr>
+      <w:r>
+        <w:rPr>
+          <w:rFonts w:ascii="Hack" w:hAnsi="Hack"/>
+          <w:color w:val="CE9178"/>
+          <w:sz w:val="20"/>
+          <w:szCs w:val="20"/>
+        </w:rPr>
+        <w:t>│(0,0)     │(1,0)     │(2,0)     │(3,0)     │</w:t>
+      </w:r>
+    </w:p>
+    <w:p>
+      <w:pPr>
+        <w:shd w:val="clear" w:color="auto" w:fill="1F1F1F"/>
+        <w:spacing w:line="300" w:lineRule="atLeast"/>
+        <w:rPr>
+          <w:rFonts w:ascii="Hack" w:hAnsi="Hack"/>
+          <w:color w:val="CCCCCC"/>
+          <w:sz w:val="20"/>
+          <w:szCs w:val="20"/>
+        </w:rPr>
+      </w:pPr>
+      <w:r>
+        <w:rPr>
+          <w:rFonts w:ascii="Hack" w:hAnsi="Hack"/>
+          <w:color w:val="CE9178"/>
+          <w:sz w:val="20"/>
+          <w:szCs w:val="20"/>
+        </w:rPr>
+        <w:t>│          │          │          │          │</w:t>
+      </w:r>
+    </w:p>
+    <w:p>
+      <w:pPr>
+        <w:shd w:val="clear" w:color="auto" w:fill="1F1F1F"/>
+        <w:spacing w:line="300" w:lineRule="atLeast"/>
+        <w:rPr>
+          <w:rFonts w:ascii="Hack" w:hAnsi="Hack"/>
+          <w:color w:val="CCCCCC"/>
+          <w:sz w:val="20"/>
+          <w:szCs w:val="20"/>
+        </w:rPr>
+      </w:pPr>
+      <w:r>
+        <w:rPr>
+          <w:rFonts w:ascii="Hack" w:hAnsi="Hack"/>
+          <w:color w:val="CE9178"/>
+          <w:sz w:val="20"/>
+          <w:szCs w:val="20"/>
+        </w:rPr>
+        <w:t>│          │          │          │ WIN GAME │</w:t>
+      </w:r>
+    </w:p>
+    <w:p>
+      <w:pPr>
+        <w:shd w:val="clear" w:color="auto" w:fill="1F1F1F"/>
+        <w:spacing w:line="300" w:lineRule="atLeast"/>
+        <w:rPr>
+          <w:rFonts w:ascii="Hack" w:hAnsi="Hack"/>
+          <w:color w:val="CCCCCC"/>
+          <w:sz w:val="20"/>
+          <w:szCs w:val="20"/>
+        </w:rPr>
+      </w:pPr>
+      <w:r>
+        <w:rPr>
+          <w:rFonts w:ascii="Hack" w:hAnsi="Hack"/>
+          <w:color w:val="CE9178"/>
+          <w:sz w:val="20"/>
+          <w:szCs w:val="20"/>
+        </w:rPr>
+        <w:t>┼──────────┼──────────┼──────────┼──────────┤</w:t>
+      </w:r>
+    </w:p>
+    <w:p>
+      <w:pPr>
+        <w:shd w:val="clear" w:color="auto" w:fill="1F1F1F"/>
+        <w:spacing w:line="300" w:lineRule="atLeast"/>
+        <w:rPr>
+          <w:rFonts w:ascii="Hack" w:hAnsi="Hack"/>
+          <w:color w:val="CCCCCC"/>
+          <w:sz w:val="20"/>
+          <w:szCs w:val="20"/>
+        </w:rPr>
+      </w:pPr>
+      <w:r>
+        <w:rPr>
+          <w:rFonts w:ascii="Hack" w:hAnsi="Hack"/>
+          <w:color w:val="CE9178"/>
+          <w:sz w:val="20"/>
+          <w:szCs w:val="20"/>
+        </w:rPr>
+        <w:t>│(0,1)     │(1,1)     │(2,1)     │(3,1)     │</w:t>
+      </w:r>
+    </w:p>
+    <w:p>
+      <w:pPr>
+        <w:shd w:val="clear" w:color="auto" w:fill="1F1F1F"/>
+        <w:spacing w:line="300" w:lineRule="atLeast"/>
+        <w:rPr>
+          <w:rFonts w:ascii="Hack" w:hAnsi="Hack"/>
+          <w:color w:val="CCCCCC"/>
+          <w:sz w:val="20"/>
+          <w:szCs w:val="20"/>
+        </w:rPr>
+      </w:pPr>
+      <w:r>
+        <w:rPr>
+          <w:rFonts w:ascii="Hack" w:hAnsi="Hack"/>
+          <w:color w:val="CE9178"/>
+          <w:sz w:val="20"/>
+          <w:szCs w:val="20"/>
+        </w:rPr>
+        <w:t>│          │          │          │          │</w:t>
+      </w:r>
+    </w:p>
+    <w:p>
+      <w:pPr>
+        <w:shd w:val="clear" w:color="auto" w:fill="1F1F1F"/>
+        <w:spacing w:line="300" w:lineRule="atLeast"/>
+        <w:rPr>
+          <w:rFonts w:ascii="Hack" w:hAnsi="Hack"/>
+          <w:color w:val="CCCCCC"/>
+          <w:sz w:val="20"/>
+          <w:szCs w:val="20"/>
+        </w:rPr>
+      </w:pPr>
+      <w:r>
+        <w:rPr>
+          <w:rFonts w:ascii="Hack" w:hAnsi="Hack"/>
+          <w:color w:val="CE9178"/>
+          <w:sz w:val="20"/>
+          <w:szCs w:val="20"/>
+        </w:rPr>
+        <w:t>│          │ OBSTACLE │          │ PENALTY  │</w:t>
+      </w:r>
+    </w:p>
+    <w:p>
+      <w:pPr>
+        <w:shd w:val="clear" w:color="auto" w:fill="1F1F1F"/>
+        <w:spacing w:line="300" w:lineRule="atLeast"/>
+        <w:rPr>
+          <w:rFonts w:ascii="Hack" w:hAnsi="Hack"/>
+          <w:color w:val="CCCCCC"/>
+          <w:sz w:val="20"/>
+          <w:szCs w:val="20"/>
+        </w:rPr>
+      </w:pPr>
+      <w:r>
+        <w:rPr>
+          <w:rFonts w:ascii="Hack" w:hAnsi="Hack"/>
+          <w:color w:val="CE9178"/>
+          <w:sz w:val="20"/>
+          <w:szCs w:val="20"/>
+        </w:rPr>
+        <w:t>┼──────────┼──────────┼──────────┼──────────┤</w:t>
+      </w:r>
+    </w:p>
+    <w:p>
+      <w:pPr>
+        <w:shd w:val="clear" w:color="auto" w:fill="1F1F1F"/>
+        <w:spacing w:line="300" w:lineRule="atLeast"/>
+        <w:rPr>
+          <w:rFonts w:ascii="Hack" w:hAnsi="Hack"/>
+          <w:color w:val="CCCCCC"/>
+          <w:sz w:val="20"/>
+          <w:szCs w:val="20"/>
+        </w:rPr>
+      </w:pPr>
+      <w:r>
+        <w:rPr>
+          <w:rFonts w:ascii="Hack" w:hAnsi="Hack"/>
+          <w:color w:val="CE9178"/>
+          <w:sz w:val="20"/>
+          <w:szCs w:val="20"/>
+        </w:rPr>
+        <w:t>│(0,2)     │(1,2)     │(2,2)     │(3,2)     │</w:t>
+      </w:r>
+    </w:p>
+    <w:p>
+      <w:pPr>
+        <w:shd w:val="clear" w:color="auto" w:fill="1F1F1F"/>
+        <w:spacing w:line="300" w:lineRule="atLeast"/>
+        <w:rPr>
+          <w:rFonts w:ascii="Hack" w:hAnsi="Hack"/>
+          <w:color w:val="CCCCCC"/>
+          <w:sz w:val="20"/>
+          <w:szCs w:val="20"/>
+        </w:rPr>
+      </w:pPr>
+      <w:r>
+        <w:rPr>
+          <w:rFonts w:ascii="Hack" w:hAnsi="Hack"/>
+          <w:color w:val="CE9178"/>
+          <w:sz w:val="20"/>
+          <w:szCs w:val="20"/>
+        </w:rPr>
+        <w:t>│          │          │          │          │</w:t>
+      </w:r>
+    </w:p>
+    <w:p>
+      <w:pPr>
+        <w:shd w:val="clear" w:color="auto" w:fill="1F1F1F"/>
+        <w:spacing w:line="300" w:lineRule="atLeast"/>
+        <w:rPr>
+          <w:rFonts w:ascii="Hack" w:hAnsi="Hack"/>
+          <w:color w:val="CCCCCC"/>
+          <w:sz w:val="20"/>
+          <w:szCs w:val="20"/>
+        </w:rPr>
+      </w:pPr>
+      <w:r>
+        <w:rPr>
+          <w:rFonts w:ascii="Hack" w:hAnsi="Hack"/>
+          <w:color w:val="CE9178"/>
+          <w:sz w:val="20"/>
+          <w:szCs w:val="20"/>
+        </w:rPr>
+        <w:t>│          │          │          │          │</w:t>
+      </w:r>
+    </w:p>
+    <w:p>
+      <w:pPr>
+        <w:shd w:val="clear" w:color="auto" w:fill="1F1F1F"/>
+        <w:spacing w:line="300" w:lineRule="atLeast"/>
+        <w:rPr>
+          <w:rFonts w:ascii="Hack" w:hAnsi="Hack"/>
+          <w:color w:val="CCCCCC"/>
+          <w:sz w:val="20"/>
+          <w:szCs w:val="20"/>
+        </w:rPr>
+      </w:pPr>
+      <w:r>
+        <w:rPr>
+          <w:rFonts w:ascii="Hack" w:hAnsi="Hack"/>
+          <w:color w:val="CE9178"/>
+          <w:sz w:val="20"/>
+          <w:szCs w:val="20"/>
+        </w:rPr>
+        <w:t>└──────────┴──────────┴──────────┴──────────┘</w:t>
+      </w:r>
+    </w:p>
+    <w:p>
+      <w:r>
+        <w:br/>
+      </w:r>
+      <w:r>
+        <w:t xml:space="preserve"> </w:t>
+      </w:r>
+    </w:p>
+    <w:p>
+      <w:r>
+        <w:t>Each move has a cost associated with it, which is the sum of the x and y coordinates of the square.</w:t>
+      </w:r>
+    </w:p>
+    <w:p>
+      <w:r>
+        <w:t>The game is considered Lost if the agent has not found the Winning block in the number of steps allowed.</w:t>
+      </w:r>
+      <w:r>
+        <w:br/>
+        <w:t>When the game starts, the agent is dropped at a random location.</w:t>
       </w:r>
     </w:p>
     <w:p/>
@@ -1533,24 +1071,34 @@
       <w:pPr>
         <w:pStyle w:val="Heading2"/>
       </w:pPr>
-      <w:bookmarkStart w:id="2" w:name="_Toc209879244"/>
+      <w:bookmarkStart w:id="2" w:name="_Toc209958855"/>
       <w:r>
         <w:t>Agent Types and PEAS Descriptions</w:t>
       </w:r>
       <w:bookmarkEnd w:id="2"/>
     </w:p>
     <w:p>
-      <w:r>
-        <w:t>Introduce and describe three distinct agent types:</w:t>
-      </w:r>
-    </w:p>
-    <w:p>
       <w:pPr>
         <w:pStyle w:val="Heading3"/>
       </w:pPr>
-      <w:bookmarkStart w:id="3" w:name="_Toc209879245"/>
-      <w:r>
-        <w:t>Agent 1: Simple Reflex Agent</w:t>
+      <w:bookmarkStart w:id="3" w:name="_Toc209958856"/>
+      <w:r>
+        <w:t xml:space="preserve">Agent </w:t>
+      </w:r>
+      <w:r>
+        <w:t>1</w:t>
+      </w:r>
+      <w:r>
+        <w:t xml:space="preserve">: </w:t>
+      </w:r>
+      <w:r>
+        <w:t>Random</w:t>
+      </w:r>
+      <w:r>
+        <w:t xml:space="preserve"> </w:t>
+      </w:r>
+      <w:r>
+        <w:t>Agent</w:t>
       </w:r>
       <w:bookmarkEnd w:id="3"/>
     </w:p>
@@ -1587,7 +1135,18 @@
         <w:t>Performance</w:t>
       </w:r>
       <w:r>
-        <w:t>: Number of goals achieved</w:t>
+        <w:t xml:space="preserve">: </w:t>
+      </w:r>
+      <w:r>
+        <w:t>+100 on winning block and Win game, -50 on penalty block, -(</w:t>
+      </w:r>
+      <w:proofErr w:type="spellStart"/>
+      <w:r>
+        <w:t>x+y</w:t>
+      </w:r>
+      <w:proofErr w:type="spellEnd"/>
+      <w:r>
+        <w:t>) per move, Lose game if Winning block not found in S steps</w:t>
       </w:r>
     </w:p>
     <w:p>
@@ -1607,6 +1166,9 @@
       <w:r>
         <w:t>: 2D grid</w:t>
       </w:r>
+      <w:r>
+        <w:t xml:space="preserve"> of width w and depth d, with winning block, penalty block and obstacle block.</w:t>
+      </w:r>
     </w:p>
     <w:p>
       <w:pPr>
@@ -1623,7 +1185,7 @@
         <w:t>Actuators</w:t>
       </w:r>
       <w:r>
-        <w:t>: Move (Up, Down, Left, Right), Act</w:t>
+        <w:t>: Move (Up, Down, Left, Right)</w:t>
       </w:r>
     </w:p>
     <w:p>
@@ -1641,61 +1203,66 @@
         <w:t>Sensors</w:t>
       </w:r>
       <w:r>
-        <w:t>: Current cell status</w:t>
-      </w:r>
+        <w:t xml:space="preserve">: </w:t>
+      </w:r>
+      <w:r>
+        <w:t xml:space="preserve">Current position. </w:t>
+      </w:r>
+      <w:proofErr w:type="spellStart"/>
+      <w:r>
+        <w:t>Percepts</w:t>
+      </w:r>
+      <w:proofErr w:type="spellEnd"/>
+      <w:r>
+        <w:t xml:space="preserve"> are ignored.</w:t>
+      </w:r>
+    </w:p>
+    <w:p>
+      <w:r>
+        <w:lastRenderedPageBreak/>
+        <w:t>The random agent</w:t>
+      </w:r>
+      <w:r>
+        <w:t xml:space="preserve"> cannot be said to be rational as it does not base it’s actions on its </w:t>
+      </w:r>
+      <w:proofErr w:type="spellStart"/>
+      <w:r>
+        <w:t>percepts</w:t>
+      </w:r>
+      <w:proofErr w:type="spellEnd"/>
+      <w:r>
+        <w:t xml:space="preserve"> or performance measure. There is no predictability of results, or attempts to maximise performance. That being said the agent is fast ,as it does not have to perform any complicated computations to determine </w:t>
+      </w:r>
+      <w:proofErr w:type="spellStart"/>
+      <w:r>
+        <w:t>it’s</w:t>
+      </w:r>
+      <w:proofErr w:type="spellEnd"/>
+      <w:r>
+        <w:t xml:space="preserve"> next action, and it has been observed win a large number of the game implemented in this assignment, when the environment is small. </w:t>
+      </w:r>
+    </w:p>
+    <w:p>
+      <w:pPr>
+        <w:pStyle w:val="Heading3"/>
+      </w:pPr>
+      <w:bookmarkStart w:id="4" w:name="_Toc209958857"/>
+      <w:r>
+        <w:t xml:space="preserve">Agent </w:t>
+      </w:r>
+      <w:r>
+        <w:t>2</w:t>
+      </w:r>
+      <w:r>
+        <w:t>: Reflex Agent</w:t>
+      </w:r>
+      <w:bookmarkEnd w:id="4"/>
     </w:p>
     <w:p>
       <w:pPr>
         <w:numPr>
           <w:ilvl w:val="0"/>
           <w:numId w:val="3"/>
-        </w:numPr>
-      </w:pPr>
-      <w:r>
-        <w:rPr>
-          <w:b/>
-          <w:bCs/>
-        </w:rPr>
-        <w:t>Advantages</w:t>
-      </w:r>
-      <w:r>
-        <w:t>: Fast, simple logic</w:t>
-      </w:r>
-    </w:p>
-    <w:p>
-      <w:pPr>
-        <w:numPr>
-          <w:ilvl w:val="0"/>
-          <w:numId w:val="3"/>
-        </w:numPr>
-      </w:pPr>
-      <w:r>
-        <w:rPr>
-          <w:b/>
-          <w:bCs/>
-        </w:rPr>
-        <w:t>Disadvantages</w:t>
-      </w:r>
-      <w:r>
-        <w:t>: No memory, poor in partially observable environments</w:t>
-      </w:r>
-    </w:p>
-    <w:p/>
-    <w:p>
-      <w:pPr>
-        <w:pStyle w:val="Heading3"/>
-      </w:pPr>
-      <w:bookmarkStart w:id="4" w:name="_Toc209879246"/>
-      <w:r>
-        <w:t>Agent 2: Model-Based Reflex Agent</w:t>
-      </w:r>
-      <w:bookmarkEnd w:id="4"/>
-    </w:p>
-    <w:p>
-      <w:pPr>
-        <w:numPr>
-          <w:ilvl w:val="0"/>
-          <w:numId w:val="4"/>
         </w:numPr>
       </w:pPr>
       <w:r>
@@ -1713,7 +1280,7 @@
       <w:pPr>
         <w:numPr>
           <w:ilvl w:val="1"/>
-          <w:numId w:val="4"/>
+          <w:numId w:val="3"/>
         </w:numPr>
       </w:pPr>
       <w:r>
@@ -1724,14 +1291,17 @@
         <w:t>Performance</w:t>
       </w:r>
       <w:r>
-        <w:t>: Efficiency in goal completion</w:t>
+        <w:t xml:space="preserve">: </w:t>
+      </w:r>
+      <w:r>
+        <w:t>As per Random Agent</w:t>
       </w:r>
     </w:p>
     <w:p>
       <w:pPr>
         <w:numPr>
           <w:ilvl w:val="1"/>
-          <w:numId w:val="4"/>
+          <w:numId w:val="3"/>
         </w:numPr>
       </w:pPr>
       <w:r>
@@ -1742,14 +1312,17 @@
         <w:t>Environment</w:t>
       </w:r>
       <w:r>
-        <w:t>: 2D grid with partial observability</w:t>
+        <w:t xml:space="preserve">: </w:t>
+      </w:r>
+      <w:r>
+        <w:t>As per Random agent</w:t>
       </w:r>
     </w:p>
     <w:p>
       <w:pPr>
         <w:numPr>
           <w:ilvl w:val="1"/>
-          <w:numId w:val="4"/>
+          <w:numId w:val="3"/>
         </w:numPr>
       </w:pPr>
       <w:r>
@@ -1760,14 +1333,17 @@
         <w:t>Actuators</w:t>
       </w:r>
       <w:r>
-        <w:t>: Same as above</w:t>
+        <w:t xml:space="preserve">: </w:t>
+      </w:r>
+      <w:r>
+        <w:t>As per Random agent</w:t>
       </w:r>
     </w:p>
     <w:p>
       <w:pPr>
         <w:numPr>
           <w:ilvl w:val="1"/>
-          <w:numId w:val="4"/>
+          <w:numId w:val="3"/>
         </w:numPr>
       </w:pPr>
       <w:r>
@@ -1778,61 +1354,42 @@
         <w:t>Sensors</w:t>
       </w:r>
       <w:r>
-        <w:t>: Current cell + internal state</w:t>
-      </w:r>
+        <w:t xml:space="preserve">: Current </w:t>
+      </w:r>
+      <w:r>
+        <w:t xml:space="preserve">position, receives </w:t>
+      </w:r>
+      <w:proofErr w:type="spellStart"/>
+      <w:r>
+        <w:t>percepts</w:t>
+      </w:r>
+      <w:proofErr w:type="spellEnd"/>
+      <w:r>
+        <w:t xml:space="preserve"> with available directions and associated costs</w:t>
+      </w:r>
+    </w:p>
+    <w:p/>
+    <w:p>
+      <w:pPr>
+        <w:pStyle w:val="Heading3"/>
+      </w:pPr>
+      <w:bookmarkStart w:id="5" w:name="_Toc209958858"/>
+      <w:r>
+        <w:t xml:space="preserve">Agent </w:t>
+      </w:r>
+      <w:r>
+        <w:t>3</w:t>
+      </w:r>
+      <w:r>
+        <w:t>: Model-Based Reflex Agent</w:t>
+      </w:r>
+      <w:bookmarkEnd w:id="5"/>
     </w:p>
     <w:p>
       <w:pPr>
         <w:numPr>
           <w:ilvl w:val="0"/>
           <w:numId w:val="4"/>
-        </w:numPr>
-      </w:pPr>
-      <w:r>
-        <w:rPr>
-          <w:b/>
-          <w:bCs/>
-        </w:rPr>
-        <w:t>Advantages</w:t>
-      </w:r>
-      <w:r>
-        <w:t>: Handles partial observability</w:t>
-      </w:r>
-    </w:p>
-    <w:p>
-      <w:pPr>
-        <w:numPr>
-          <w:ilvl w:val="0"/>
-          <w:numId w:val="4"/>
-        </w:numPr>
-      </w:pPr>
-      <w:r>
-        <w:rPr>
-          <w:b/>
-          <w:bCs/>
-        </w:rPr>
-        <w:t>Disadvantages</w:t>
-      </w:r>
-      <w:r>
-        <w:t>: More complex, needs accurate model</w:t>
-      </w:r>
-    </w:p>
-    <w:p/>
-    <w:p>
-      <w:pPr>
-        <w:pStyle w:val="Heading3"/>
-      </w:pPr>
-      <w:bookmarkStart w:id="5" w:name="_Toc209879247"/>
-      <w:r>
-        <w:t>Agent 3: Goal-Based Agent</w:t>
-      </w:r>
-      <w:bookmarkEnd w:id="5"/>
-    </w:p>
-    <w:p>
-      <w:pPr>
-        <w:numPr>
-          <w:ilvl w:val="0"/>
-          <w:numId w:val="5"/>
         </w:numPr>
       </w:pPr>
       <w:r>
@@ -1850,7 +1407,7 @@
       <w:pPr>
         <w:numPr>
           <w:ilvl w:val="1"/>
-          <w:numId w:val="5"/>
+          <w:numId w:val="4"/>
         </w:numPr>
       </w:pPr>
       <w:r>
@@ -1861,14 +1418,17 @@
         <w:t>Performance</w:t>
       </w:r>
       <w:r>
-        <w:t>: Reaching defined goal states</w:t>
+        <w:t xml:space="preserve">: </w:t>
+      </w:r>
+      <w:r>
+        <w:t>As per Random agent</w:t>
       </w:r>
     </w:p>
     <w:p>
       <w:pPr>
         <w:numPr>
           <w:ilvl w:val="1"/>
-          <w:numId w:val="5"/>
+          <w:numId w:val="4"/>
         </w:numPr>
       </w:pPr>
       <w:r>
@@ -1879,14 +1439,17 @@
         <w:t>Environment</w:t>
       </w:r>
       <w:r>
-        <w:t>: Dynamic 2D grid</w:t>
+        <w:t xml:space="preserve">: </w:t>
+      </w:r>
+      <w:r>
+        <w:t>As per Random agent</w:t>
       </w:r>
     </w:p>
     <w:p>
       <w:pPr>
         <w:numPr>
           <w:ilvl w:val="1"/>
-          <w:numId w:val="5"/>
+          <w:numId w:val="4"/>
         </w:numPr>
       </w:pPr>
       <w:r>
@@ -1897,14 +1460,17 @@
         <w:t>Actuators</w:t>
       </w:r>
       <w:r>
-        <w:t>: Same</w:t>
+        <w:t xml:space="preserve">: </w:t>
+      </w:r>
+      <w:r>
+        <w:t>As per Random agent</w:t>
       </w:r>
     </w:p>
     <w:p>
       <w:pPr>
         <w:numPr>
           <w:ilvl w:val="1"/>
-          <w:numId w:val="5"/>
+          <w:numId w:val="4"/>
         </w:numPr>
       </w:pPr>
       <w:r>
@@ -1915,51 +1481,19 @@
         <w:t>Sensors</w:t>
       </w:r>
       <w:r>
-        <w:t>: Current cell + goal state</w:t>
-      </w:r>
-    </w:p>
-    <w:p>
-      <w:pPr>
-        <w:numPr>
-          <w:ilvl w:val="0"/>
-          <w:numId w:val="5"/>
-        </w:numPr>
-      </w:pPr>
-      <w:r>
-        <w:rPr>
-          <w:b/>
-          <w:bCs/>
-        </w:rPr>
-        <w:t>Advantages</w:t>
-      </w:r>
-      <w:r>
-        <w:t>: Flexible, goal-oriented</w:t>
-      </w:r>
-    </w:p>
-    <w:p>
-      <w:pPr>
-        <w:numPr>
-          <w:ilvl w:val="0"/>
-          <w:numId w:val="5"/>
-        </w:numPr>
-      </w:pPr>
-      <w:r>
-        <w:rPr>
-          <w:b/>
-          <w:bCs/>
-        </w:rPr>
-        <w:t>Disadvantages</w:t>
-      </w:r>
-      <w:r>
-        <w:t>: Requires search/planning</w:t>
+        <w:t xml:space="preserve">: </w:t>
+      </w:r>
+      <w:r>
+        <w:t>As per Reflex Agent. Also maintains an internal model of visited blocks, destination locations and obstacles</w:t>
       </w:r>
     </w:p>
     <w:p/>
+    <w:p/>
     <w:p>
       <w:pPr>
         <w:pStyle w:val="Heading2"/>
       </w:pPr>
-      <w:bookmarkStart w:id="6" w:name="_Toc209879248"/>
+      <w:bookmarkStart w:id="6" w:name="_Toc209958859"/>
       <w:r>
         <w:t>Agent Evaluation</w:t>
       </w:r>
@@ -1998,544 +1532,32 @@
         <w:t>Discuss underperformance scenarios</w:t>
       </w:r>
     </w:p>
-    <w:p/>
     <w:p>
       <w:pPr>
-        <w:rPr>
-          <w:b/>
-          <w:bCs/>
-        </w:rPr>
-      </w:pPr>
-      <w:r>
-        <w:rPr>
-          <w:b/>
-          <w:bCs/>
-        </w:rPr>
-        <w:lastRenderedPageBreak/>
-        <w:br w:type="page"/>
-      </w:r>
+        <w:ind w:left="720"/>
+      </w:pPr>
     </w:p>
     <w:p>
       <w:pPr>
-        <w:pStyle w:val="Heading1"/>
-      </w:pPr>
-      <w:bookmarkStart w:id="7" w:name="_Toc209879249"/>
-      <w:r>
-        <w:lastRenderedPageBreak/>
-        <w:t>1.2 Searching Your World (Search Techniques)</w:t>
-      </w:r>
-      <w:bookmarkEnd w:id="7"/>
-    </w:p>
-    <w:p>
-      <w:pPr>
-        <w:pStyle w:val="Heading2"/>
-      </w:pPr>
-      <w:bookmarkStart w:id="8" w:name="_Toc209879250"/>
-      <w:r>
-        <w:t>Problem Formulation</w:t>
-      </w:r>
-      <w:bookmarkEnd w:id="8"/>
-    </w:p>
-    <w:p>
-      <w:pPr>
-        <w:numPr>
-          <w:ilvl w:val="0"/>
-          <w:numId w:val="7"/>
-        </w:numPr>
-      </w:pPr>
-      <w:r>
-        <w:t>Define initial state, actions, transition model, goal test, path cost</w:t>
-      </w:r>
-    </w:p>
-    <w:p>
-      <w:pPr>
-        <w:numPr>
-          <w:ilvl w:val="0"/>
-          <w:numId w:val="7"/>
-        </w:numPr>
-      </w:pPr>
-      <w:r>
-        <w:t>Explain why search is necessary in your world</w:t>
-      </w:r>
-    </w:p>
-    <w:p>
-      <w:pPr>
+        <w:ind w:left="720"/>
+      </w:pPr>
+      <w:r>
         <w:rPr>
-          <w:b/>
-          <w:bCs/>
+          <w:noProof/>
         </w:rPr>
-      </w:pPr>
-    </w:p>
-    <w:p>
-      <w:pPr>
-        <w:pStyle w:val="Heading2"/>
-      </w:pPr>
-      <w:bookmarkStart w:id="9" w:name="_Toc209879251"/>
-      <w:r>
-        <w:t>Uninformed Search Techniques</w:t>
-      </w:r>
-      <w:bookmarkEnd w:id="9"/>
-    </w:p>
-    <w:p>
-      <w:r>
-        <w:t>Select and describe three techniques:</w:t>
-      </w:r>
-    </w:p>
-    <w:p>
-      <w:pPr>
-        <w:pStyle w:val="Heading3"/>
-        <w:numPr>
-          <w:ilvl w:val="0"/>
-          <w:numId w:val="17"/>
-        </w:numPr>
-      </w:pPr>
-      <w:bookmarkStart w:id="10" w:name="_Toc209879252"/>
-      <w:r>
-        <w:t>Breadth-First Search (BFS)</w:t>
-      </w:r>
-      <w:bookmarkEnd w:id="10"/>
-    </w:p>
-    <w:p>
-      <w:pPr>
-        <w:numPr>
-          <w:ilvl w:val="0"/>
-          <w:numId w:val="8"/>
-        </w:numPr>
-        <w:tabs>
-          <w:tab w:val="num" w:pos="720"/>
-        </w:tabs>
-      </w:pPr>
-      <w:r>
-        <w:t>Complete, optimal (if step cost = 1)</w:t>
-      </w:r>
-    </w:p>
-    <w:p>
-      <w:pPr>
-        <w:numPr>
-          <w:ilvl w:val="0"/>
-          <w:numId w:val="8"/>
-        </w:numPr>
-        <w:tabs>
-          <w:tab w:val="num" w:pos="720"/>
-        </w:tabs>
-      </w:pPr>
-      <w:r>
-        <w:t>Time/space complexity: </w:t>
-      </w:r>
-      <m:oMath>
-        <m:r>
-          <w:rPr>
-            <w:rFonts w:ascii="Cambria Math" w:hAnsi="Cambria Math"/>
-          </w:rPr>
-          <m:t>O(</m:t>
-        </m:r>
-        <m:sSup>
-          <m:sSupPr>
-            <m:ctrlPr>
-              <w:rPr>
-                <w:rFonts w:ascii="Cambria Math" w:hAnsi="Cambria Math"/>
-              </w:rPr>
-            </m:ctrlPr>
-          </m:sSupPr>
-          <m:e>
-            <m:r>
-              <w:rPr>
-                <w:rFonts w:ascii="Cambria Math" w:hAnsi="Cambria Math"/>
-              </w:rPr>
-              <m:t>b</m:t>
-            </m:r>
-          </m:e>
-          <m:sup>
-            <m:r>
-              <w:rPr>
-                <w:rFonts w:ascii="Cambria Math" w:hAnsi="Cambria Math"/>
-              </w:rPr>
-              <m:t>d</m:t>
-            </m:r>
-          </m:sup>
-        </m:sSup>
-        <m:r>
-          <w:rPr>
-            <w:rFonts w:ascii="Cambria Math" w:hAnsi="Cambria Math"/>
-          </w:rPr>
-          <m:t>)</m:t>
-        </m:r>
-      </m:oMath>
-    </w:p>
-    <w:p>
-      <w:pPr>
-        <w:pStyle w:val="Heading3"/>
-        <w:numPr>
-          <w:ilvl w:val="0"/>
-          <w:numId w:val="17"/>
-        </w:numPr>
-      </w:pPr>
-      <w:bookmarkStart w:id="11" w:name="_Toc209879253"/>
-      <w:r>
-        <w:t>Uniform-Cost Search</w:t>
-      </w:r>
-      <w:bookmarkEnd w:id="11"/>
-    </w:p>
-    <w:p>
-      <w:pPr>
-        <w:numPr>
-          <w:ilvl w:val="0"/>
-          <w:numId w:val="9"/>
-        </w:numPr>
-        <w:tabs>
-          <w:tab w:val="num" w:pos="720"/>
-        </w:tabs>
-      </w:pPr>
-      <w:r>
-        <w:t>Optimal for varying path costs</w:t>
-      </w:r>
-    </w:p>
-    <w:p>
-      <w:pPr>
-        <w:numPr>
-          <w:ilvl w:val="0"/>
-          <w:numId w:val="9"/>
-        </w:numPr>
-        <w:tabs>
-          <w:tab w:val="num" w:pos="720"/>
-        </w:tabs>
-      </w:pPr>
-      <w:r>
-        <w:t>Uses priority queue based on path cost</w:t>
-      </w:r>
-    </w:p>
-    <w:p>
-      <w:pPr>
-        <w:pStyle w:val="Heading3"/>
-        <w:numPr>
-          <w:ilvl w:val="0"/>
-          <w:numId w:val="17"/>
-        </w:numPr>
-      </w:pPr>
-      <w:bookmarkStart w:id="12" w:name="_Toc209879254"/>
-      <w:r>
-        <w:t>Depth-First Search (DFS)</w:t>
-      </w:r>
-      <w:bookmarkEnd w:id="12"/>
-    </w:p>
-    <w:p>
-      <w:pPr>
-        <w:numPr>
-          <w:ilvl w:val="0"/>
-          <w:numId w:val="10"/>
-        </w:numPr>
-        <w:tabs>
-          <w:tab w:val="num" w:pos="720"/>
-        </w:tabs>
-      </w:pPr>
-      <w:r>
-        <w:t>Low memory usage</w:t>
-      </w:r>
-    </w:p>
-    <w:p>
-      <w:pPr>
-        <w:numPr>
-          <w:ilvl w:val="0"/>
-          <w:numId w:val="10"/>
-        </w:numPr>
-      </w:pPr>
-      <w:r>
-        <w:t>May not be complete or optimal</w:t>
-      </w:r>
-    </w:p>
-    <w:p/>
-    <w:p>
-      <w:pPr>
-        <w:pStyle w:val="Heading2"/>
-      </w:pPr>
-      <w:bookmarkStart w:id="13" w:name="_Toc209879255"/>
-      <w:r>
-        <w:t>Informed Search Techniques</w:t>
-      </w:r>
-      <w:bookmarkEnd w:id="13"/>
-    </w:p>
-    <w:p>
-      <w:r>
-        <w:t>Select and describe three techniques:</w:t>
-      </w:r>
-    </w:p>
-    <w:p>
-      <w:pPr>
-        <w:pStyle w:val="Heading3"/>
-        <w:numPr>
-          <w:ilvl w:val="0"/>
-          <w:numId w:val="18"/>
-        </w:numPr>
-      </w:pPr>
-      <w:bookmarkStart w:id="14" w:name="_Toc209879256"/>
-      <w:r>
-        <w:t>Greedy Best-First Search</w:t>
-      </w:r>
-      <w:bookmarkEnd w:id="14"/>
-    </w:p>
-    <w:p>
-      <w:pPr>
-        <w:numPr>
-          <w:ilvl w:val="0"/>
-          <w:numId w:val="11"/>
-        </w:numPr>
-        <w:tabs>
-          <w:tab w:val="num" w:pos="720"/>
-        </w:tabs>
-      </w:pPr>
-      <w:r>
-        <w:t>Uses heuristic to guide search</w:t>
-      </w:r>
-    </w:p>
-    <w:p>
-      <w:pPr>
-        <w:numPr>
-          <w:ilvl w:val="0"/>
-          <w:numId w:val="11"/>
-        </w:numPr>
-        <w:tabs>
-          <w:tab w:val="num" w:pos="720"/>
-        </w:tabs>
-      </w:pPr>
-      <w:r>
-        <w:t>Fast but not always optimal</w:t>
-      </w:r>
-    </w:p>
-    <w:p>
-      <w:pPr>
-        <w:pStyle w:val="Heading3"/>
-        <w:numPr>
-          <w:ilvl w:val="0"/>
-          <w:numId w:val="18"/>
-        </w:numPr>
-      </w:pPr>
-      <w:bookmarkStart w:id="15" w:name="_Toc209879257"/>
-      <w:r>
-        <w:t>A Search*</w:t>
-      </w:r>
-      <w:bookmarkEnd w:id="15"/>
-    </w:p>
-    <w:p>
-      <w:pPr>
-        <w:numPr>
-          <w:ilvl w:val="0"/>
-          <w:numId w:val="12"/>
-        </w:numPr>
-        <w:tabs>
-          <w:tab w:val="num" w:pos="720"/>
-        </w:tabs>
-      </w:pPr>
-      <w:r>
-        <w:t>Combines path cost and heuristic</w:t>
-      </w:r>
-    </w:p>
-    <w:p>
-      <w:pPr>
-        <w:numPr>
-          <w:ilvl w:val="0"/>
-          <w:numId w:val="12"/>
-        </w:numPr>
-        <w:tabs>
-          <w:tab w:val="num" w:pos="720"/>
-        </w:tabs>
-      </w:pPr>
-      <w:r>
-        <w:t>Complete and optimal if heuristic is admissible</w:t>
-      </w:r>
-    </w:p>
-    <w:p>
-      <w:pPr>
-        <w:pStyle w:val="Heading3"/>
-        <w:numPr>
-          <w:ilvl w:val="0"/>
-          <w:numId w:val="18"/>
-        </w:numPr>
-      </w:pPr>
-      <w:bookmarkStart w:id="16" w:name="_Toc209879258"/>
-      <w:r>
-        <w:t>Iterative Deepening A*</w:t>
-      </w:r>
-      <w:bookmarkEnd w:id="16"/>
-    </w:p>
-    <w:p>
-      <w:pPr>
-        <w:numPr>
-          <w:ilvl w:val="0"/>
-          <w:numId w:val="13"/>
-        </w:numPr>
-        <w:tabs>
-          <w:tab w:val="num" w:pos="720"/>
-        </w:tabs>
-      </w:pPr>
-      <w:r>
-        <w:t>Combines benefits of DFS and A*</w:t>
-      </w:r>
-    </w:p>
-    <w:p>
-      <w:pPr>
-        <w:numPr>
-          <w:ilvl w:val="0"/>
-          <w:numId w:val="13"/>
-        </w:numPr>
-        <w:tabs>
-          <w:tab w:val="num" w:pos="720"/>
-        </w:tabs>
-      </w:pPr>
-      <w:r>
-        <w:t>Good for large state spaces</w:t>
-      </w:r>
-    </w:p>
-    <w:p>
-      <w:pPr>
-        <w:rPr>
-          <w:b/>
-          <w:bCs/>
-        </w:rPr>
-      </w:pPr>
-    </w:p>
-    <w:p>
-      <w:pPr>
-        <w:rPr>
-          <w:b/>
-          <w:bCs/>
-        </w:rPr>
-      </w:pPr>
-    </w:p>
-    <w:p>
-      <w:pPr>
-        <w:pStyle w:val="Heading2"/>
-      </w:pPr>
-      <w:bookmarkStart w:id="17" w:name="_Toc209879259"/>
-      <w:r>
-        <w:t>Performance Evaluation</w:t>
-      </w:r>
-      <w:bookmarkEnd w:id="17"/>
-    </w:p>
-    <w:p>
-      <w:pPr>
-        <w:numPr>
-          <w:ilvl w:val="0"/>
-          <w:numId w:val="14"/>
-        </w:numPr>
-      </w:pPr>
-      <w:r>
-        <w:t>Compare techniques using:</w:t>
-      </w:r>
-    </w:p>
-    <w:p>
-      <w:pPr>
-        <w:numPr>
-          <w:ilvl w:val="1"/>
-          <w:numId w:val="14"/>
-        </w:numPr>
-      </w:pPr>
-      <w:r>
-        <w:t>Completeness</w:t>
-      </w:r>
-    </w:p>
-    <w:p>
-      <w:pPr>
-        <w:numPr>
-          <w:ilvl w:val="1"/>
-          <w:numId w:val="14"/>
-        </w:numPr>
-      </w:pPr>
-      <w:r>
-        <w:t>Optimality</w:t>
-      </w:r>
-    </w:p>
-    <w:p>
-      <w:pPr>
-        <w:numPr>
-          <w:ilvl w:val="1"/>
-          <w:numId w:val="14"/>
-        </w:numPr>
-      </w:pPr>
-      <w:r>
-        <w:t>Time complexity</w:t>
-      </w:r>
-    </w:p>
-    <w:p>
-      <w:pPr>
-        <w:numPr>
-          <w:ilvl w:val="1"/>
-          <w:numId w:val="14"/>
-        </w:numPr>
-      </w:pPr>
-      <w:r>
-        <w:t>Space complexity</w:t>
-      </w:r>
-    </w:p>
-    <w:p>
-      <w:pPr>
-        <w:numPr>
-          <w:ilvl w:val="0"/>
-          <w:numId w:val="14"/>
-        </w:numPr>
-      </w:pPr>
-      <w:r>
-        <w:lastRenderedPageBreak/>
-        <w:t>Use experimental results (tables/graphs)</w:t>
-      </w:r>
-    </w:p>
-    <w:p/>
-    <w:p>
-      <w:pPr>
-        <w:rPr>
-          <w:b/>
-          <w:bCs/>
-        </w:rPr>
-      </w:pPr>
-      <w:r>
-        <w:rPr>
-          <w:b/>
-          <w:bCs/>
-        </w:rPr>
-        <w:br w:type="page"/>
-      </w:r>
-    </w:p>
-    <w:p>
-      <w:pPr>
-        <w:pStyle w:val="Heading1"/>
-      </w:pPr>
-      <w:bookmarkStart w:id="18" w:name="_Toc209879260"/>
-      <w:r>
-        <w:lastRenderedPageBreak/>
-        <w:t>Conclusion</w:t>
-      </w:r>
-      <w:bookmarkEnd w:id="18"/>
-    </w:p>
-    <w:p>
-      <w:pPr>
-        <w:numPr>
-          <w:ilvl w:val="0"/>
-          <w:numId w:val="15"/>
-        </w:numPr>
-      </w:pPr>
-      <w:r>
-        <w:t>Summarize key findings</w:t>
-      </w:r>
-    </w:p>
-    <w:p>
-      <w:pPr>
-        <w:numPr>
-          <w:ilvl w:val="0"/>
-          <w:numId w:val="15"/>
-        </w:numPr>
-      </w:pPr>
-      <w:r>
-        <w:t>Reflect on agent suitability and search efficiency</w:t>
-      </w:r>
-    </w:p>
-    <w:p>
-      <w:pPr>
-        <w:numPr>
-          <w:ilvl w:val="0"/>
-          <w:numId w:val="15"/>
-        </w:numPr>
-      </w:pPr>
-      <w:r>
-        <w:t>Suggest improvements or future work</w:t>
+        <w:drawing>
+          <wp:inline distT="0" distB="0" distL="0" distR="0" wp14:anchorId="50B12510" wp14:editId="36E7C27C">
+            <wp:extent cx="5331012" cy="3200400"/>
+            <wp:effectExtent l="0" t="0" r="15875" b="12700"/>
+            <wp:docPr id="2133250972" name="Chart 1"/>
+            <wp:cNvGraphicFramePr/>
+            <a:graphic xmlns:a="http://schemas.openxmlformats.org/drawingml/2006/main">
+              <a:graphicData uri="http://schemas.openxmlformats.org/drawingml/2006/chart">
+                <c:chart xmlns:c="http://schemas.openxmlformats.org/drawingml/2006/chart" xmlns:r="http://schemas.openxmlformats.org/officeDocument/2006/relationships" r:id="rId6"/>
+              </a:graphicData>
+            </a:graphic>
+          </wp:inline>
+        </w:drawing>
       </w:r>
     </w:p>
     <w:sectPr>
@@ -5565,6 +4587,13 @@
   <w:style w:type="paragraph" w:default="1" w:styleId="Normal">
     <w:name w:val="Normal"/>
     <w:qFormat/>
+    <w:rsid w:val="00D364A9"/>
+    <w:rPr>
+      <w:rFonts w:ascii="Times New Roman" w:eastAsia="Times New Roman" w:hAnsi="Times New Roman" w:cs="Times New Roman"/>
+      <w:kern w:val="0"/>
+      <w:lang w:eastAsia="en-GB"/>
+      <w14:ligatures w14:val="none"/>
+    </w:rPr>
   </w:style>
   <w:style w:type="paragraph" w:styleId="Heading1">
     <w:name w:val="heading 1"/>
@@ -5583,8 +4612,11 @@
     <w:rPr>
       <w:rFonts w:asciiTheme="majorHAnsi" w:eastAsiaTheme="majorEastAsia" w:hAnsiTheme="majorHAnsi" w:cstheme="majorBidi"/>
       <w:color w:val="0F4761" w:themeColor="accent1" w:themeShade="BF"/>
+      <w:kern w:val="2"/>
       <w:sz w:val="40"/>
       <w:szCs w:val="40"/>
+      <w:lang w:eastAsia="en-US"/>
+      <w14:ligatures w14:val="standardContextual"/>
     </w:rPr>
   </w:style>
   <w:style w:type="paragraph" w:styleId="Heading2">
@@ -5605,8 +4637,11 @@
     <w:rPr>
       <w:rFonts w:asciiTheme="majorHAnsi" w:eastAsiaTheme="majorEastAsia" w:hAnsiTheme="majorHAnsi" w:cstheme="majorBidi"/>
       <w:color w:val="0F4761" w:themeColor="accent1" w:themeShade="BF"/>
+      <w:kern w:val="2"/>
       <w:sz w:val="32"/>
       <w:szCs w:val="32"/>
+      <w:lang w:eastAsia="en-US"/>
+      <w14:ligatures w14:val="standardContextual"/>
     </w:rPr>
   </w:style>
   <w:style w:type="paragraph" w:styleId="Heading3">
@@ -5625,10 +4660,13 @@
       <w:outlineLvl w:val="2"/>
     </w:pPr>
     <w:rPr>
-      <w:rFonts w:eastAsiaTheme="majorEastAsia" w:cstheme="majorBidi"/>
+      <w:rFonts w:asciiTheme="minorHAnsi" w:eastAsiaTheme="majorEastAsia" w:hAnsiTheme="minorHAnsi" w:cstheme="majorBidi"/>
       <w:color w:val="0F4761" w:themeColor="accent1" w:themeShade="BF"/>
+      <w:kern w:val="2"/>
       <w:sz w:val="28"/>
       <w:szCs w:val="28"/>
+      <w:lang w:eastAsia="en-US"/>
+      <w14:ligatures w14:val="standardContextual"/>
     </w:rPr>
   </w:style>
   <w:style w:type="paragraph" w:styleId="Heading4">
@@ -5648,10 +4686,13 @@
       <w:outlineLvl w:val="3"/>
     </w:pPr>
     <w:rPr>
-      <w:rFonts w:eastAsiaTheme="majorEastAsia" w:cstheme="majorBidi"/>
+      <w:rFonts w:asciiTheme="minorHAnsi" w:eastAsiaTheme="majorEastAsia" w:hAnsiTheme="minorHAnsi" w:cstheme="majorBidi"/>
       <w:i/>
       <w:iCs/>
       <w:color w:val="0F4761" w:themeColor="accent1" w:themeShade="BF"/>
+      <w:kern w:val="2"/>
+      <w:lang w:eastAsia="en-US"/>
+      <w14:ligatures w14:val="standardContextual"/>
     </w:rPr>
   </w:style>
   <w:style w:type="paragraph" w:styleId="Heading5">
@@ -5671,8 +4712,11 @@
       <w:outlineLvl w:val="4"/>
     </w:pPr>
     <w:rPr>
-      <w:rFonts w:eastAsiaTheme="majorEastAsia" w:cstheme="majorBidi"/>
+      <w:rFonts w:asciiTheme="minorHAnsi" w:eastAsiaTheme="majorEastAsia" w:hAnsiTheme="minorHAnsi" w:cstheme="majorBidi"/>
       <w:color w:val="0F4761" w:themeColor="accent1" w:themeShade="BF"/>
+      <w:kern w:val="2"/>
+      <w:lang w:eastAsia="en-US"/>
+      <w14:ligatures w14:val="standardContextual"/>
     </w:rPr>
   </w:style>
   <w:style w:type="paragraph" w:styleId="Heading6">
@@ -5692,10 +4736,13 @@
       <w:outlineLvl w:val="5"/>
     </w:pPr>
     <w:rPr>
-      <w:rFonts w:eastAsiaTheme="majorEastAsia" w:cstheme="majorBidi"/>
+      <w:rFonts w:asciiTheme="minorHAnsi" w:eastAsiaTheme="majorEastAsia" w:hAnsiTheme="minorHAnsi" w:cstheme="majorBidi"/>
       <w:i/>
       <w:iCs/>
       <w:color w:val="595959" w:themeColor="text1" w:themeTint="A6"/>
+      <w:kern w:val="2"/>
+      <w:lang w:eastAsia="en-US"/>
+      <w14:ligatures w14:val="standardContextual"/>
     </w:rPr>
   </w:style>
   <w:style w:type="paragraph" w:styleId="Heading7">
@@ -5715,8 +4762,11 @@
       <w:outlineLvl w:val="6"/>
     </w:pPr>
     <w:rPr>
-      <w:rFonts w:eastAsiaTheme="majorEastAsia" w:cstheme="majorBidi"/>
+      <w:rFonts w:asciiTheme="minorHAnsi" w:eastAsiaTheme="majorEastAsia" w:hAnsiTheme="minorHAnsi" w:cstheme="majorBidi"/>
       <w:color w:val="595959" w:themeColor="text1" w:themeTint="A6"/>
+      <w:kern w:val="2"/>
+      <w:lang w:eastAsia="en-US"/>
+      <w14:ligatures w14:val="standardContextual"/>
     </w:rPr>
   </w:style>
   <w:style w:type="paragraph" w:styleId="Heading8">
@@ -5735,10 +4785,13 @@
       <w:outlineLvl w:val="7"/>
     </w:pPr>
     <w:rPr>
-      <w:rFonts w:eastAsiaTheme="majorEastAsia" w:cstheme="majorBidi"/>
+      <w:rFonts w:asciiTheme="minorHAnsi" w:eastAsiaTheme="majorEastAsia" w:hAnsiTheme="minorHAnsi" w:cstheme="majorBidi"/>
       <w:i/>
       <w:iCs/>
       <w:color w:val="272727" w:themeColor="text1" w:themeTint="D8"/>
+      <w:kern w:val="2"/>
+      <w:lang w:eastAsia="en-US"/>
+      <w14:ligatures w14:val="standardContextual"/>
     </w:rPr>
   </w:style>
   <w:style w:type="paragraph" w:styleId="Heading9">
@@ -5757,8 +4810,11 @@
       <w:outlineLvl w:val="8"/>
     </w:pPr>
     <w:rPr>
-      <w:rFonts w:eastAsiaTheme="majorEastAsia" w:cstheme="majorBidi"/>
+      <w:rFonts w:asciiTheme="minorHAnsi" w:eastAsiaTheme="majorEastAsia" w:hAnsiTheme="minorHAnsi" w:cstheme="majorBidi"/>
       <w:color w:val="272727" w:themeColor="text1" w:themeTint="D8"/>
+      <w:kern w:val="2"/>
+      <w:lang w:eastAsia="en-US"/>
+      <w14:ligatures w14:val="standardContextual"/>
     </w:rPr>
   </w:style>
   <w:style w:type="character" w:default="1" w:styleId="DefaultParagraphFont">
@@ -5922,6 +4978,8 @@
       <w:kern w:val="28"/>
       <w:sz w:val="56"/>
       <w:szCs w:val="56"/>
+      <w:lang w:eastAsia="en-US"/>
+      <w14:ligatures w14:val="standardContextual"/>
     </w:rPr>
   </w:style>
   <w:style w:type="character" w:customStyle="1" w:styleId="TitleChar">
@@ -5953,11 +5011,14 @@
       <w:spacing w:after="160"/>
     </w:pPr>
     <w:rPr>
-      <w:rFonts w:eastAsiaTheme="majorEastAsia" w:cstheme="majorBidi"/>
+      <w:rFonts w:asciiTheme="minorHAnsi" w:eastAsiaTheme="majorEastAsia" w:hAnsiTheme="minorHAnsi" w:cstheme="majorBidi"/>
       <w:color w:val="595959" w:themeColor="text1" w:themeTint="A6"/>
       <w:spacing w:val="15"/>
+      <w:kern w:val="2"/>
       <w:sz w:val="28"/>
       <w:szCs w:val="28"/>
+      <w:lang w:eastAsia="en-US"/>
+      <w14:ligatures w14:val="standardContextual"/>
     </w:rPr>
   </w:style>
   <w:style w:type="character" w:customStyle="1" w:styleId="SubtitleChar">
@@ -5987,9 +5048,13 @@
       <w:jc w:val="center"/>
     </w:pPr>
     <w:rPr>
+      <w:rFonts w:asciiTheme="minorHAnsi" w:eastAsiaTheme="minorHAnsi" w:hAnsiTheme="minorHAnsi" w:cstheme="minorBidi"/>
       <w:i/>
       <w:iCs/>
       <w:color w:val="404040" w:themeColor="text1" w:themeTint="BF"/>
+      <w:kern w:val="2"/>
+      <w:lang w:eastAsia="en-US"/>
+      <w14:ligatures w14:val="standardContextual"/>
     </w:rPr>
   </w:style>
   <w:style w:type="character" w:customStyle="1" w:styleId="QuoteChar">
@@ -6014,6 +5079,12 @@
       <w:ind w:left="720"/>
       <w:contextualSpacing/>
     </w:pPr>
+    <w:rPr>
+      <w:rFonts w:asciiTheme="minorHAnsi" w:eastAsiaTheme="minorHAnsi" w:hAnsiTheme="minorHAnsi" w:cstheme="minorBidi"/>
+      <w:kern w:val="2"/>
+      <w:lang w:eastAsia="en-US"/>
+      <w14:ligatures w14:val="standardContextual"/>
+    </w:rPr>
   </w:style>
   <w:style w:type="character" w:styleId="IntenseEmphasis">
     <w:name w:val="Intense Emphasis"/>
@@ -6045,9 +5116,13 @@
       <w:jc w:val="center"/>
     </w:pPr>
     <w:rPr>
+      <w:rFonts w:asciiTheme="minorHAnsi" w:eastAsiaTheme="minorHAnsi" w:hAnsiTheme="minorHAnsi" w:cstheme="minorBidi"/>
       <w:i/>
       <w:iCs/>
       <w:color w:val="0F4761" w:themeColor="accent1" w:themeShade="BF"/>
+      <w:kern w:val="2"/>
+      <w:lang w:eastAsia="en-US"/>
+      <w14:ligatures w14:val="standardContextual"/>
     </w:rPr>
   </w:style>
   <w:style w:type="character" w:customStyle="1" w:styleId="IntenseQuoteChar">
@@ -6131,10 +5206,14 @@
       <w:spacing w:before="120"/>
     </w:pPr>
     <w:rPr>
+      <w:rFonts w:asciiTheme="minorHAnsi" w:eastAsiaTheme="minorHAnsi" w:hAnsiTheme="minorHAnsi" w:cstheme="minorBidi"/>
       <w:b/>
       <w:bCs/>
       <w:i/>
       <w:iCs/>
+      <w:kern w:val="2"/>
+      <w:lang w:eastAsia="en-US"/>
+      <w14:ligatures w14:val="standardContextual"/>
     </w:rPr>
   </w:style>
   <w:style w:type="paragraph" w:styleId="TOC2">
@@ -6150,10 +5229,14 @@
       <w:ind w:left="240"/>
     </w:pPr>
     <w:rPr>
+      <w:rFonts w:asciiTheme="minorHAnsi" w:eastAsiaTheme="minorHAnsi" w:hAnsiTheme="minorHAnsi" w:cstheme="minorBidi"/>
       <w:b/>
       <w:bCs/>
+      <w:kern w:val="2"/>
       <w:sz w:val="22"/>
       <w:szCs w:val="22"/>
+      <w:lang w:eastAsia="en-US"/>
+      <w14:ligatures w14:val="standardContextual"/>
     </w:rPr>
   </w:style>
   <w:style w:type="paragraph" w:styleId="TOC3">
@@ -6168,8 +5251,12 @@
       <w:ind w:left="480"/>
     </w:pPr>
     <w:rPr>
+      <w:rFonts w:asciiTheme="minorHAnsi" w:eastAsiaTheme="minorHAnsi" w:hAnsiTheme="minorHAnsi" w:cstheme="minorBidi"/>
+      <w:kern w:val="2"/>
       <w:sz w:val="20"/>
       <w:szCs w:val="20"/>
+      <w:lang w:eastAsia="en-US"/>
+      <w14:ligatures w14:val="standardContextual"/>
     </w:rPr>
   </w:style>
   <w:style w:type="character" w:styleId="Hyperlink">
@@ -6196,8 +5283,12 @@
       <w:ind w:left="720"/>
     </w:pPr>
     <w:rPr>
+      <w:rFonts w:asciiTheme="minorHAnsi" w:eastAsiaTheme="minorHAnsi" w:hAnsiTheme="minorHAnsi" w:cstheme="minorBidi"/>
+      <w:kern w:val="2"/>
       <w:sz w:val="20"/>
       <w:szCs w:val="20"/>
+      <w:lang w:eastAsia="en-US"/>
+      <w14:ligatures w14:val="standardContextual"/>
     </w:rPr>
   </w:style>
   <w:style w:type="paragraph" w:styleId="TOC5">
@@ -6213,8 +5304,12 @@
       <w:ind w:left="960"/>
     </w:pPr>
     <w:rPr>
+      <w:rFonts w:asciiTheme="minorHAnsi" w:eastAsiaTheme="minorHAnsi" w:hAnsiTheme="minorHAnsi" w:cstheme="minorBidi"/>
+      <w:kern w:val="2"/>
       <w:sz w:val="20"/>
       <w:szCs w:val="20"/>
+      <w:lang w:eastAsia="en-US"/>
+      <w14:ligatures w14:val="standardContextual"/>
     </w:rPr>
   </w:style>
   <w:style w:type="paragraph" w:styleId="TOC6">
@@ -6230,8 +5325,12 @@
       <w:ind w:left="1200"/>
     </w:pPr>
     <w:rPr>
+      <w:rFonts w:asciiTheme="minorHAnsi" w:eastAsiaTheme="minorHAnsi" w:hAnsiTheme="minorHAnsi" w:cstheme="minorBidi"/>
+      <w:kern w:val="2"/>
       <w:sz w:val="20"/>
       <w:szCs w:val="20"/>
+      <w:lang w:eastAsia="en-US"/>
+      <w14:ligatures w14:val="standardContextual"/>
     </w:rPr>
   </w:style>
   <w:style w:type="paragraph" w:styleId="TOC7">
@@ -6247,8 +5346,12 @@
       <w:ind w:left="1440"/>
     </w:pPr>
     <w:rPr>
+      <w:rFonts w:asciiTheme="minorHAnsi" w:eastAsiaTheme="minorHAnsi" w:hAnsiTheme="minorHAnsi" w:cstheme="minorBidi"/>
+      <w:kern w:val="2"/>
       <w:sz w:val="20"/>
       <w:szCs w:val="20"/>
+      <w:lang w:eastAsia="en-US"/>
+      <w14:ligatures w14:val="standardContextual"/>
     </w:rPr>
   </w:style>
   <w:style w:type="paragraph" w:styleId="TOC8">
@@ -6264,8 +5367,12 @@
       <w:ind w:left="1680"/>
     </w:pPr>
     <w:rPr>
+      <w:rFonts w:asciiTheme="minorHAnsi" w:eastAsiaTheme="minorHAnsi" w:hAnsiTheme="minorHAnsi" w:cstheme="minorBidi"/>
+      <w:kern w:val="2"/>
       <w:sz w:val="20"/>
       <w:szCs w:val="20"/>
+      <w:lang w:eastAsia="en-US"/>
+      <w14:ligatures w14:val="standardContextual"/>
     </w:rPr>
   </w:style>
   <w:style w:type="paragraph" w:styleId="TOC9">
@@ -6281,11 +5388,1505 @@
       <w:ind w:left="1920"/>
     </w:pPr>
     <w:rPr>
+      <w:rFonts w:asciiTheme="minorHAnsi" w:eastAsiaTheme="minorHAnsi" w:hAnsiTheme="minorHAnsi" w:cstheme="minorBidi"/>
+      <w:kern w:val="2"/>
       <w:sz w:val="20"/>
       <w:szCs w:val="20"/>
+      <w:lang w:eastAsia="en-US"/>
+      <w14:ligatures w14:val="standardContextual"/>
     </w:rPr>
   </w:style>
+  <w:style w:type="character" w:styleId="Strong">
+    <w:name w:val="Strong"/>
+    <w:basedOn w:val="DefaultParagraphFont"/>
+    <w:uiPriority w:val="22"/>
+    <w:qFormat/>
+    <w:rsid w:val="00A50F89"/>
+    <w:rPr>
+      <w:b/>
+      <w:bCs/>
+    </w:rPr>
+  </w:style>
+  <w:style w:type="character" w:customStyle="1" w:styleId="apple-converted-space">
+    <w:name w:val="apple-converted-space"/>
+    <w:basedOn w:val="DefaultParagraphFont"/>
+    <w:rsid w:val="00A50F89"/>
+  </w:style>
 </w:styles>
+</file>
+
+<file path=word/charts/chart1.xml><?xml version="1.0" encoding="utf-8"?>
+<c:chartSpace xmlns:c="http://schemas.openxmlformats.org/drawingml/2006/chart" xmlns:a="http://schemas.openxmlformats.org/drawingml/2006/main" xmlns:r="http://schemas.openxmlformats.org/officeDocument/2006/relationships" xmlns:c16r2="http://schemas.microsoft.com/office/drawing/2015/06/chart">
+  <c:date1904 val="0"/>
+  <c:lang val="en-GB"/>
+  <c:roundedCorners val="0"/>
+  <mc:AlternateContent xmlns:mc="http://schemas.openxmlformats.org/markup-compatibility/2006">
+    <mc:Choice xmlns:c14="http://schemas.microsoft.com/office/drawing/2007/8/2/chart" Requires="c14">
+      <c14:style val="102"/>
+    </mc:Choice>
+    <mc:Fallback>
+      <c:style val="2"/>
+    </mc:Fallback>
+  </mc:AlternateContent>
+  <c:chart>
+    <c:title>
+      <c:tx>
+        <c:rich>
+          <a:bodyPr rot="0" spcFirstLastPara="1" vertOverflow="ellipsis" vert="horz" wrap="square" anchor="ctr" anchorCtr="1"/>
+          <a:lstStyle/>
+          <a:p>
+            <a:pPr>
+              <a:defRPr sz="1400" b="0" i="0" u="none" strike="noStrike" kern="1200" spc="0" baseline="0">
+                <a:solidFill>
+                  <a:schemeClr val="tx1">
+                    <a:lumMod val="65000"/>
+                    <a:lumOff val="35000"/>
+                  </a:schemeClr>
+                </a:solidFill>
+                <a:latin typeface="+mn-lt"/>
+                <a:ea typeface="+mn-ea"/>
+                <a:cs typeface="+mn-cs"/>
+              </a:defRPr>
+            </a:pPr>
+            <a:r>
+              <a:rPr lang="en-GB"/>
+              <a:t>% of wins as Grid size increases</a:t>
+            </a:r>
+            <a:br>
+              <a:rPr lang="en-GB"/>
+            </a:br>
+            <a:r>
+              <a:rPr lang="en-GB"/>
+              <a:t>(steps=50 runs=100000)</a:t>
+            </a:r>
+          </a:p>
+        </c:rich>
+      </c:tx>
+      <c:overlay val="0"/>
+      <c:spPr>
+        <a:noFill/>
+        <a:ln>
+          <a:noFill/>
+        </a:ln>
+        <a:effectLst/>
+      </c:spPr>
+      <c:txPr>
+        <a:bodyPr rot="0" spcFirstLastPara="1" vertOverflow="ellipsis" vert="horz" wrap="square" anchor="ctr" anchorCtr="1"/>
+        <a:lstStyle/>
+        <a:p>
+          <a:pPr>
+            <a:defRPr sz="1400" b="0" i="0" u="none" strike="noStrike" kern="1200" spc="0" baseline="0">
+              <a:solidFill>
+                <a:schemeClr val="tx1">
+                  <a:lumMod val="65000"/>
+                  <a:lumOff val="35000"/>
+                </a:schemeClr>
+              </a:solidFill>
+              <a:latin typeface="+mn-lt"/>
+              <a:ea typeface="+mn-ea"/>
+              <a:cs typeface="+mn-cs"/>
+            </a:defRPr>
+          </a:pPr>
+          <a:endParaRPr lang="en-US"/>
+        </a:p>
+      </c:txPr>
+    </c:title>
+    <c:autoTitleDeleted val="0"/>
+    <c:view3D>
+      <c:rotX val="30"/>
+      <c:rotY val="20"/>
+      <c:depthPercent val="190"/>
+      <c:rAngAx val="0"/>
+      <c:perspective val="40"/>
+    </c:view3D>
+    <c:floor>
+      <c:thickness val="0"/>
+      <c:spPr>
+        <a:noFill/>
+        <a:ln>
+          <a:noFill/>
+        </a:ln>
+        <a:effectLst/>
+        <a:sp3d/>
+      </c:spPr>
+    </c:floor>
+    <c:sideWall>
+      <c:thickness val="0"/>
+      <c:spPr>
+        <a:noFill/>
+        <a:ln>
+          <a:noFill/>
+        </a:ln>
+        <a:effectLst/>
+        <a:sp3d/>
+      </c:spPr>
+    </c:sideWall>
+    <c:backWall>
+      <c:thickness val="0"/>
+      <c:spPr>
+        <a:noFill/>
+        <a:ln>
+          <a:noFill/>
+        </a:ln>
+        <a:effectLst/>
+        <a:sp3d/>
+      </c:spPr>
+    </c:backWall>
+    <c:plotArea>
+      <c:layout>
+        <c:manualLayout>
+          <c:layoutTarget val="inner"/>
+          <c:xMode val="edge"/>
+          <c:yMode val="edge"/>
+          <c:x val="9.2530518259368866E-2"/>
+          <c:y val="7.9722222222222222E-2"/>
+          <c:w val="0.67393298702329019"/>
+          <c:h val="0.54163573303337087"/>
+        </c:manualLayout>
+      </c:layout>
+      <c:line3DChart>
+        <c:grouping val="standard"/>
+        <c:varyColors val="0"/>
+        <c:ser>
+          <c:idx val="0"/>
+          <c:order val="0"/>
+          <c:tx>
+            <c:strRef>
+              <c:f>Sheet1!$B$1</c:f>
+              <c:strCache>
+                <c:ptCount val="1"/>
+                <c:pt idx="0">
+                  <c:v>Random</c:v>
+                </c:pt>
+              </c:strCache>
+            </c:strRef>
+          </c:tx>
+          <c:spPr>
+            <a:solidFill>
+              <a:schemeClr val="accent1"/>
+            </a:solidFill>
+            <a:ln>
+              <a:noFill/>
+            </a:ln>
+            <a:effectLst/>
+            <a:sp3d/>
+          </c:spPr>
+          <c:cat>
+            <c:strRef>
+              <c:f>Sheet1!$A$2:$A$23</c:f>
+              <c:strCache>
+                <c:ptCount val="22"/>
+                <c:pt idx="0">
+                  <c:v>4x4</c:v>
+                </c:pt>
+                <c:pt idx="1">
+                  <c:v>5x5</c:v>
+                </c:pt>
+                <c:pt idx="2">
+                  <c:v>6x6</c:v>
+                </c:pt>
+                <c:pt idx="3">
+                  <c:v>7x7</c:v>
+                </c:pt>
+                <c:pt idx="4">
+                  <c:v>8x8</c:v>
+                </c:pt>
+                <c:pt idx="5">
+                  <c:v>9x9</c:v>
+                </c:pt>
+                <c:pt idx="6">
+                  <c:v>10x10</c:v>
+                </c:pt>
+                <c:pt idx="7">
+                  <c:v>11x11</c:v>
+                </c:pt>
+                <c:pt idx="8">
+                  <c:v>12x12</c:v>
+                </c:pt>
+                <c:pt idx="9">
+                  <c:v>13x13</c:v>
+                </c:pt>
+                <c:pt idx="10">
+                  <c:v>14x14</c:v>
+                </c:pt>
+                <c:pt idx="11">
+                  <c:v>15x15</c:v>
+                </c:pt>
+                <c:pt idx="12">
+                  <c:v>16x16</c:v>
+                </c:pt>
+                <c:pt idx="13">
+                  <c:v>17x17</c:v>
+                </c:pt>
+                <c:pt idx="14">
+                  <c:v>18x18</c:v>
+                </c:pt>
+                <c:pt idx="15">
+                  <c:v>19x19</c:v>
+                </c:pt>
+                <c:pt idx="16">
+                  <c:v>20x20</c:v>
+                </c:pt>
+                <c:pt idx="17">
+                  <c:v>21x21</c:v>
+                </c:pt>
+                <c:pt idx="18">
+                  <c:v>22x22</c:v>
+                </c:pt>
+                <c:pt idx="19">
+                  <c:v>23x23</c:v>
+                </c:pt>
+                <c:pt idx="20">
+                  <c:v>24x24</c:v>
+                </c:pt>
+                <c:pt idx="21">
+                  <c:v>25x25</c:v>
+                </c:pt>
+              </c:strCache>
+            </c:strRef>
+          </c:cat>
+          <c:val>
+            <c:numRef>
+              <c:f>Sheet1!$B$2:$B$23</c:f>
+              <c:numCache>
+                <c:formatCode>General</c:formatCode>
+                <c:ptCount val="22"/>
+                <c:pt idx="0">
+                  <c:v>92</c:v>
+                </c:pt>
+                <c:pt idx="1">
+                  <c:v>61</c:v>
+                </c:pt>
+                <c:pt idx="2">
+                  <c:v>32</c:v>
+                </c:pt>
+                <c:pt idx="3">
+                  <c:v>35</c:v>
+                </c:pt>
+                <c:pt idx="4">
+                  <c:v>23</c:v>
+                </c:pt>
+                <c:pt idx="5">
+                  <c:v>26</c:v>
+                </c:pt>
+                <c:pt idx="6">
+                  <c:v>25</c:v>
+                </c:pt>
+                <c:pt idx="7">
+                  <c:v>22</c:v>
+                </c:pt>
+                <c:pt idx="8">
+                  <c:v>11</c:v>
+                </c:pt>
+                <c:pt idx="9">
+                  <c:v>12</c:v>
+                </c:pt>
+                <c:pt idx="10">
+                  <c:v>12</c:v>
+                </c:pt>
+                <c:pt idx="11">
+                  <c:v>0</c:v>
+                </c:pt>
+                <c:pt idx="12">
+                  <c:v>0</c:v>
+                </c:pt>
+                <c:pt idx="13">
+                  <c:v>7</c:v>
+                </c:pt>
+                <c:pt idx="14">
+                  <c:v>0</c:v>
+                </c:pt>
+                <c:pt idx="15">
+                  <c:v>0</c:v>
+                </c:pt>
+                <c:pt idx="16">
+                  <c:v>0</c:v>
+                </c:pt>
+                <c:pt idx="17">
+                  <c:v>0</c:v>
+                </c:pt>
+                <c:pt idx="18">
+                  <c:v>0</c:v>
+                </c:pt>
+                <c:pt idx="19">
+                  <c:v>0</c:v>
+                </c:pt>
+                <c:pt idx="20">
+                  <c:v>0</c:v>
+                </c:pt>
+                <c:pt idx="21">
+                  <c:v>0</c:v>
+                </c:pt>
+              </c:numCache>
+            </c:numRef>
+          </c:val>
+          <c:smooth val="0"/>
+          <c:extLst>
+            <c:ext xmlns:c16="http://schemas.microsoft.com/office/drawing/2014/chart" uri="{C3380CC4-5D6E-409C-BE32-E72D297353CC}">
+              <c16:uniqueId val="{00000000-D86D-8F48-8B8D-7A4BCFF53F45}"/>
+            </c:ext>
+          </c:extLst>
+        </c:ser>
+        <c:ser>
+          <c:idx val="1"/>
+          <c:order val="1"/>
+          <c:tx>
+            <c:strRef>
+              <c:f>Sheet1!$C$1</c:f>
+              <c:strCache>
+                <c:ptCount val="1"/>
+                <c:pt idx="0">
+                  <c:v>Reflex</c:v>
+                </c:pt>
+              </c:strCache>
+            </c:strRef>
+          </c:tx>
+          <c:spPr>
+            <a:solidFill>
+              <a:schemeClr val="accent2"/>
+            </a:solidFill>
+            <a:ln>
+              <a:noFill/>
+            </a:ln>
+            <a:effectLst/>
+            <a:sp3d/>
+          </c:spPr>
+          <c:cat>
+            <c:strRef>
+              <c:f>Sheet1!$A$2:$A$23</c:f>
+              <c:strCache>
+                <c:ptCount val="22"/>
+                <c:pt idx="0">
+                  <c:v>4x4</c:v>
+                </c:pt>
+                <c:pt idx="1">
+                  <c:v>5x5</c:v>
+                </c:pt>
+                <c:pt idx="2">
+                  <c:v>6x6</c:v>
+                </c:pt>
+                <c:pt idx="3">
+                  <c:v>7x7</c:v>
+                </c:pt>
+                <c:pt idx="4">
+                  <c:v>8x8</c:v>
+                </c:pt>
+                <c:pt idx="5">
+                  <c:v>9x9</c:v>
+                </c:pt>
+                <c:pt idx="6">
+                  <c:v>10x10</c:v>
+                </c:pt>
+                <c:pt idx="7">
+                  <c:v>11x11</c:v>
+                </c:pt>
+                <c:pt idx="8">
+                  <c:v>12x12</c:v>
+                </c:pt>
+                <c:pt idx="9">
+                  <c:v>13x13</c:v>
+                </c:pt>
+                <c:pt idx="10">
+                  <c:v>14x14</c:v>
+                </c:pt>
+                <c:pt idx="11">
+                  <c:v>15x15</c:v>
+                </c:pt>
+                <c:pt idx="12">
+                  <c:v>16x16</c:v>
+                </c:pt>
+                <c:pt idx="13">
+                  <c:v>17x17</c:v>
+                </c:pt>
+                <c:pt idx="14">
+                  <c:v>18x18</c:v>
+                </c:pt>
+                <c:pt idx="15">
+                  <c:v>19x19</c:v>
+                </c:pt>
+                <c:pt idx="16">
+                  <c:v>20x20</c:v>
+                </c:pt>
+                <c:pt idx="17">
+                  <c:v>21x21</c:v>
+                </c:pt>
+                <c:pt idx="18">
+                  <c:v>22x22</c:v>
+                </c:pt>
+                <c:pt idx="19">
+                  <c:v>23x23</c:v>
+                </c:pt>
+                <c:pt idx="20">
+                  <c:v>24x24</c:v>
+                </c:pt>
+                <c:pt idx="21">
+                  <c:v>25x25</c:v>
+                </c:pt>
+              </c:strCache>
+            </c:strRef>
+          </c:cat>
+          <c:val>
+            <c:numRef>
+              <c:f>Sheet1!$C$2:$C$23</c:f>
+              <c:numCache>
+                <c:formatCode>General</c:formatCode>
+                <c:ptCount val="22"/>
+                <c:pt idx="0">
+                  <c:v>38</c:v>
+                </c:pt>
+                <c:pt idx="1">
+                  <c:v>100</c:v>
+                </c:pt>
+                <c:pt idx="2">
+                  <c:v>15</c:v>
+                </c:pt>
+                <c:pt idx="3">
+                  <c:v>0</c:v>
+                </c:pt>
+                <c:pt idx="4">
+                  <c:v>88</c:v>
+                </c:pt>
+                <c:pt idx="5">
+                  <c:v>6</c:v>
+                </c:pt>
+                <c:pt idx="6">
+                  <c:v>49</c:v>
+                </c:pt>
+                <c:pt idx="7">
+                  <c:v>0</c:v>
+                </c:pt>
+                <c:pt idx="8">
+                  <c:v>6</c:v>
+                </c:pt>
+                <c:pt idx="9">
+                  <c:v>3</c:v>
+                </c:pt>
+                <c:pt idx="10">
+                  <c:v>2</c:v>
+                </c:pt>
+                <c:pt idx="11">
+                  <c:v>0</c:v>
+                </c:pt>
+                <c:pt idx="12">
+                  <c:v>20</c:v>
+                </c:pt>
+                <c:pt idx="13">
+                  <c:v>0</c:v>
+                </c:pt>
+                <c:pt idx="14">
+                  <c:v>1</c:v>
+                </c:pt>
+                <c:pt idx="15">
+                  <c:v>2</c:v>
+                </c:pt>
+                <c:pt idx="16">
+                  <c:v>2</c:v>
+                </c:pt>
+                <c:pt idx="17">
+                  <c:v>0</c:v>
+                </c:pt>
+                <c:pt idx="18">
+                  <c:v>0</c:v>
+                </c:pt>
+                <c:pt idx="19">
+                  <c:v>0</c:v>
+                </c:pt>
+                <c:pt idx="20">
+                  <c:v>0</c:v>
+                </c:pt>
+                <c:pt idx="21">
+                  <c:v>0</c:v>
+                </c:pt>
+              </c:numCache>
+            </c:numRef>
+          </c:val>
+          <c:smooth val="0"/>
+          <c:extLst>
+            <c:ext xmlns:c16="http://schemas.microsoft.com/office/drawing/2014/chart" uri="{C3380CC4-5D6E-409C-BE32-E72D297353CC}">
+              <c16:uniqueId val="{00000001-D86D-8F48-8B8D-7A4BCFF53F45}"/>
+            </c:ext>
+          </c:extLst>
+        </c:ser>
+        <c:ser>
+          <c:idx val="2"/>
+          <c:order val="2"/>
+          <c:tx>
+            <c:strRef>
+              <c:f>Sheet1!$D$1</c:f>
+              <c:strCache>
+                <c:ptCount val="1"/>
+                <c:pt idx="0">
+                  <c:v>Model</c:v>
+                </c:pt>
+              </c:strCache>
+            </c:strRef>
+          </c:tx>
+          <c:spPr>
+            <a:solidFill>
+              <a:schemeClr val="accent3"/>
+            </a:solidFill>
+            <a:ln>
+              <a:noFill/>
+            </a:ln>
+            <a:effectLst/>
+            <a:sp3d/>
+          </c:spPr>
+          <c:cat>
+            <c:strRef>
+              <c:f>Sheet1!$A$2:$A$23</c:f>
+              <c:strCache>
+                <c:ptCount val="22"/>
+                <c:pt idx="0">
+                  <c:v>4x4</c:v>
+                </c:pt>
+                <c:pt idx="1">
+                  <c:v>5x5</c:v>
+                </c:pt>
+                <c:pt idx="2">
+                  <c:v>6x6</c:v>
+                </c:pt>
+                <c:pt idx="3">
+                  <c:v>7x7</c:v>
+                </c:pt>
+                <c:pt idx="4">
+                  <c:v>8x8</c:v>
+                </c:pt>
+                <c:pt idx="5">
+                  <c:v>9x9</c:v>
+                </c:pt>
+                <c:pt idx="6">
+                  <c:v>10x10</c:v>
+                </c:pt>
+                <c:pt idx="7">
+                  <c:v>11x11</c:v>
+                </c:pt>
+                <c:pt idx="8">
+                  <c:v>12x12</c:v>
+                </c:pt>
+                <c:pt idx="9">
+                  <c:v>13x13</c:v>
+                </c:pt>
+                <c:pt idx="10">
+                  <c:v>14x14</c:v>
+                </c:pt>
+                <c:pt idx="11">
+                  <c:v>15x15</c:v>
+                </c:pt>
+                <c:pt idx="12">
+                  <c:v>16x16</c:v>
+                </c:pt>
+                <c:pt idx="13">
+                  <c:v>17x17</c:v>
+                </c:pt>
+                <c:pt idx="14">
+                  <c:v>18x18</c:v>
+                </c:pt>
+                <c:pt idx="15">
+                  <c:v>19x19</c:v>
+                </c:pt>
+                <c:pt idx="16">
+                  <c:v>20x20</c:v>
+                </c:pt>
+                <c:pt idx="17">
+                  <c:v>21x21</c:v>
+                </c:pt>
+                <c:pt idx="18">
+                  <c:v>22x22</c:v>
+                </c:pt>
+                <c:pt idx="19">
+                  <c:v>23x23</c:v>
+                </c:pt>
+                <c:pt idx="20">
+                  <c:v>24x24</c:v>
+                </c:pt>
+                <c:pt idx="21">
+                  <c:v>25x25</c:v>
+                </c:pt>
+              </c:strCache>
+            </c:strRef>
+          </c:cat>
+          <c:val>
+            <c:numRef>
+              <c:f>Sheet1!$D$2:$D$23</c:f>
+              <c:numCache>
+                <c:formatCode>General</c:formatCode>
+                <c:ptCount val="22"/>
+                <c:pt idx="0">
+                  <c:v>88</c:v>
+                </c:pt>
+                <c:pt idx="1">
+                  <c:v>85</c:v>
+                </c:pt>
+                <c:pt idx="2">
+                  <c:v>53</c:v>
+                </c:pt>
+                <c:pt idx="3">
+                  <c:v>36</c:v>
+                </c:pt>
+                <c:pt idx="4">
+                  <c:v>42</c:v>
+                </c:pt>
+                <c:pt idx="5">
+                  <c:v>20</c:v>
+                </c:pt>
+                <c:pt idx="6">
+                  <c:v>23</c:v>
+                </c:pt>
+                <c:pt idx="7">
+                  <c:v>23</c:v>
+                </c:pt>
+                <c:pt idx="8">
+                  <c:v>0</c:v>
+                </c:pt>
+                <c:pt idx="9">
+                  <c:v>0</c:v>
+                </c:pt>
+                <c:pt idx="10">
+                  <c:v>8</c:v>
+                </c:pt>
+                <c:pt idx="11">
+                  <c:v>6</c:v>
+                </c:pt>
+                <c:pt idx="12">
+                  <c:v>9</c:v>
+                </c:pt>
+                <c:pt idx="13">
+                  <c:v>0</c:v>
+                </c:pt>
+                <c:pt idx="14">
+                  <c:v>0</c:v>
+                </c:pt>
+                <c:pt idx="15">
+                  <c:v>0</c:v>
+                </c:pt>
+                <c:pt idx="16">
+                  <c:v>0</c:v>
+                </c:pt>
+                <c:pt idx="17">
+                  <c:v>0</c:v>
+                </c:pt>
+                <c:pt idx="18">
+                  <c:v>0</c:v>
+                </c:pt>
+                <c:pt idx="19">
+                  <c:v>0</c:v>
+                </c:pt>
+                <c:pt idx="20">
+                  <c:v>2</c:v>
+                </c:pt>
+                <c:pt idx="21">
+                  <c:v>0</c:v>
+                </c:pt>
+              </c:numCache>
+            </c:numRef>
+          </c:val>
+          <c:smooth val="0"/>
+          <c:extLst>
+            <c:ext xmlns:c16="http://schemas.microsoft.com/office/drawing/2014/chart" uri="{C3380CC4-5D6E-409C-BE32-E72D297353CC}">
+              <c16:uniqueId val="{00000002-D86D-8F48-8B8D-7A4BCFF53F45}"/>
+            </c:ext>
+          </c:extLst>
+        </c:ser>
+        <c:dLbls>
+          <c:showLegendKey val="0"/>
+          <c:showVal val="0"/>
+          <c:showCatName val="0"/>
+          <c:showSerName val="0"/>
+          <c:showPercent val="0"/>
+          <c:showBubbleSize val="0"/>
+        </c:dLbls>
+        <c:axId val="1457828543"/>
+        <c:axId val="1457821375"/>
+        <c:axId val="1465638911"/>
+      </c:line3DChart>
+      <c:catAx>
+        <c:axId val="1457828543"/>
+        <c:scaling>
+          <c:orientation val="minMax"/>
+        </c:scaling>
+        <c:delete val="0"/>
+        <c:axPos val="b"/>
+        <c:numFmt formatCode="General" sourceLinked="1"/>
+        <c:majorTickMark val="out"/>
+        <c:minorTickMark val="none"/>
+        <c:tickLblPos val="nextTo"/>
+        <c:spPr>
+          <a:noFill/>
+          <a:ln w="9525" cap="flat" cmpd="sng" algn="ctr">
+            <a:solidFill>
+              <a:schemeClr val="tx1">
+                <a:lumMod val="15000"/>
+                <a:lumOff val="85000"/>
+              </a:schemeClr>
+            </a:solidFill>
+            <a:round/>
+          </a:ln>
+          <a:effectLst/>
+        </c:spPr>
+        <c:txPr>
+          <a:bodyPr rot="-60000000" spcFirstLastPara="1" vertOverflow="ellipsis" vert="horz" wrap="square" anchor="ctr" anchorCtr="1"/>
+          <a:lstStyle/>
+          <a:p>
+            <a:pPr>
+              <a:defRPr sz="900" b="0" i="0" u="none" strike="noStrike" kern="1200" baseline="0">
+                <a:solidFill>
+                  <a:schemeClr val="tx1">
+                    <a:lumMod val="65000"/>
+                    <a:lumOff val="35000"/>
+                  </a:schemeClr>
+                </a:solidFill>
+                <a:latin typeface="+mn-lt"/>
+                <a:ea typeface="+mn-ea"/>
+                <a:cs typeface="+mn-cs"/>
+              </a:defRPr>
+            </a:pPr>
+            <a:endParaRPr lang="en-US"/>
+          </a:p>
+        </c:txPr>
+        <c:crossAx val="1457821375"/>
+        <c:crosses val="autoZero"/>
+        <c:auto val="1"/>
+        <c:lblAlgn val="ctr"/>
+        <c:lblOffset val="100"/>
+        <c:noMultiLvlLbl val="0"/>
+      </c:catAx>
+      <c:valAx>
+        <c:axId val="1457821375"/>
+        <c:scaling>
+          <c:orientation val="minMax"/>
+        </c:scaling>
+        <c:delete val="0"/>
+        <c:axPos val="l"/>
+        <c:majorGridlines>
+          <c:spPr>
+            <a:ln w="9525" cap="flat" cmpd="sng" algn="ctr">
+              <a:solidFill>
+                <a:schemeClr val="tx1">
+                  <a:lumMod val="15000"/>
+                  <a:lumOff val="85000"/>
+                </a:schemeClr>
+              </a:solidFill>
+              <a:round/>
+            </a:ln>
+            <a:effectLst/>
+          </c:spPr>
+        </c:majorGridlines>
+        <c:numFmt formatCode="General" sourceLinked="1"/>
+        <c:majorTickMark val="none"/>
+        <c:minorTickMark val="none"/>
+        <c:tickLblPos val="nextTo"/>
+        <c:spPr>
+          <a:noFill/>
+          <a:ln>
+            <a:noFill/>
+          </a:ln>
+          <a:effectLst/>
+        </c:spPr>
+        <c:txPr>
+          <a:bodyPr rot="-60000000" spcFirstLastPara="1" vertOverflow="ellipsis" vert="horz" wrap="square" anchor="ctr" anchorCtr="1"/>
+          <a:lstStyle/>
+          <a:p>
+            <a:pPr>
+              <a:defRPr sz="900" b="0" i="0" u="none" strike="noStrike" kern="1200" baseline="0">
+                <a:solidFill>
+                  <a:schemeClr val="tx1">
+                    <a:lumMod val="65000"/>
+                    <a:lumOff val="35000"/>
+                  </a:schemeClr>
+                </a:solidFill>
+                <a:latin typeface="+mn-lt"/>
+                <a:ea typeface="+mn-ea"/>
+                <a:cs typeface="+mn-cs"/>
+              </a:defRPr>
+            </a:pPr>
+            <a:endParaRPr lang="en-US"/>
+          </a:p>
+        </c:txPr>
+        <c:crossAx val="1457828543"/>
+        <c:crosses val="autoZero"/>
+        <c:crossBetween val="between"/>
+      </c:valAx>
+      <c:serAx>
+        <c:axId val="1465638911"/>
+        <c:scaling>
+          <c:orientation val="minMax"/>
+        </c:scaling>
+        <c:delete val="0"/>
+        <c:axPos val="b"/>
+        <c:majorTickMark val="out"/>
+        <c:minorTickMark val="none"/>
+        <c:tickLblPos val="nextTo"/>
+        <c:spPr>
+          <a:noFill/>
+          <a:ln w="9525" cap="flat" cmpd="sng" algn="ctr">
+            <a:solidFill>
+              <a:schemeClr val="tx1">
+                <a:lumMod val="15000"/>
+                <a:lumOff val="85000"/>
+              </a:schemeClr>
+            </a:solidFill>
+            <a:round/>
+          </a:ln>
+          <a:effectLst/>
+        </c:spPr>
+        <c:txPr>
+          <a:bodyPr rot="-60000000" spcFirstLastPara="1" vertOverflow="ellipsis" vert="horz" wrap="square" anchor="ctr" anchorCtr="1"/>
+          <a:lstStyle/>
+          <a:p>
+            <a:pPr>
+              <a:defRPr sz="900" b="0" i="0" u="none" strike="noStrike" kern="1200" baseline="0">
+                <a:solidFill>
+                  <a:schemeClr val="tx1">
+                    <a:lumMod val="65000"/>
+                    <a:lumOff val="35000"/>
+                  </a:schemeClr>
+                </a:solidFill>
+                <a:latin typeface="+mn-lt"/>
+                <a:ea typeface="+mn-ea"/>
+                <a:cs typeface="+mn-cs"/>
+              </a:defRPr>
+            </a:pPr>
+            <a:endParaRPr lang="en-US"/>
+          </a:p>
+        </c:txPr>
+        <c:crossAx val="1457821375"/>
+        <c:crosses val="autoZero"/>
+      </c:serAx>
+      <c:spPr>
+        <a:noFill/>
+        <a:ln>
+          <a:noFill/>
+        </a:ln>
+        <a:effectLst/>
+      </c:spPr>
+    </c:plotArea>
+    <c:legend>
+      <c:legendPos val="b"/>
+      <c:overlay val="0"/>
+      <c:spPr>
+        <a:noFill/>
+        <a:ln>
+          <a:noFill/>
+        </a:ln>
+        <a:effectLst/>
+      </c:spPr>
+      <c:txPr>
+        <a:bodyPr rot="0" spcFirstLastPara="1" vertOverflow="ellipsis" vert="horz" wrap="square" anchor="ctr" anchorCtr="1"/>
+        <a:lstStyle/>
+        <a:p>
+          <a:pPr>
+            <a:defRPr sz="900" b="0" i="0" u="none" strike="noStrike" kern="1200" baseline="0">
+              <a:solidFill>
+                <a:schemeClr val="tx1">
+                  <a:lumMod val="65000"/>
+                  <a:lumOff val="35000"/>
+                </a:schemeClr>
+              </a:solidFill>
+              <a:latin typeface="+mn-lt"/>
+              <a:ea typeface="+mn-ea"/>
+              <a:cs typeface="+mn-cs"/>
+            </a:defRPr>
+          </a:pPr>
+          <a:endParaRPr lang="en-US"/>
+        </a:p>
+      </c:txPr>
+    </c:legend>
+    <c:plotVisOnly val="1"/>
+    <c:dispBlanksAs val="gap"/>
+    <c:showDLblsOverMax val="0"/>
+    <c:extLst>
+      <c:ext xmlns:c16r3="http://schemas.microsoft.com/office/drawing/2017/03/chart" uri="{56B9EC1D-385E-4148-901F-78D8002777C0}">
+        <c16r3:dataDisplayOptions16>
+          <c16r3:dispNaAsBlank val="1"/>
+        </c16r3:dataDisplayOptions16>
+      </c:ext>
+    </c:extLst>
+  </c:chart>
+  <c:spPr>
+    <a:solidFill>
+      <a:schemeClr val="bg1"/>
+    </a:solidFill>
+    <a:ln w="9525" cap="flat" cmpd="sng" algn="ctr">
+      <a:solidFill>
+        <a:schemeClr val="tx1">
+          <a:lumMod val="15000"/>
+          <a:lumOff val="85000"/>
+        </a:schemeClr>
+      </a:solidFill>
+      <a:round/>
+    </a:ln>
+    <a:effectLst/>
+  </c:spPr>
+  <c:txPr>
+    <a:bodyPr/>
+    <a:lstStyle/>
+    <a:p>
+      <a:pPr>
+        <a:defRPr/>
+      </a:pPr>
+      <a:endParaRPr lang="en-US"/>
+    </a:p>
+  </c:txPr>
+  <c:externalData r:id="rId3">
+    <c:autoUpdate val="0"/>
+  </c:externalData>
+</c:chartSpace>
+</file>
+
+<file path=word/charts/colors1.xml><?xml version="1.0" encoding="utf-8"?>
+<cs:colorStyle xmlns:cs="http://schemas.microsoft.com/office/drawing/2012/chartStyle" xmlns:a="http://schemas.openxmlformats.org/drawingml/2006/main" meth="cycle" id="10">
+  <a:schemeClr val="accent1"/>
+  <a:schemeClr val="accent2"/>
+  <a:schemeClr val="accent3"/>
+  <a:schemeClr val="accent4"/>
+  <a:schemeClr val="accent5"/>
+  <a:schemeClr val="accent6"/>
+  <cs:variation/>
+  <cs:variation>
+    <a:lumMod val="60000"/>
+  </cs:variation>
+  <cs:variation>
+    <a:lumMod val="80000"/>
+    <a:lumOff val="20000"/>
+  </cs:variation>
+  <cs:variation>
+    <a:lumMod val="80000"/>
+  </cs:variation>
+  <cs:variation>
+    <a:lumMod val="60000"/>
+    <a:lumOff val="40000"/>
+  </cs:variation>
+  <cs:variation>
+    <a:lumMod val="50000"/>
+  </cs:variation>
+  <cs:variation>
+    <a:lumMod val="70000"/>
+    <a:lumOff val="30000"/>
+  </cs:variation>
+  <cs:variation>
+    <a:lumMod val="70000"/>
+  </cs:variation>
+  <cs:variation>
+    <a:lumMod val="50000"/>
+    <a:lumOff val="50000"/>
+  </cs:variation>
+</cs:colorStyle>
+</file>
+
+<file path=word/charts/style1.xml><?xml version="1.0" encoding="utf-8"?>
+<cs:chartStyle xmlns:cs="http://schemas.microsoft.com/office/drawing/2012/chartStyle" xmlns:a="http://schemas.openxmlformats.org/drawingml/2006/main" id="307">
+  <cs:axisTitle>
+    <cs:lnRef idx="0"/>
+    <cs:fillRef idx="0"/>
+    <cs:effectRef idx="0"/>
+    <cs:fontRef idx="minor">
+      <a:schemeClr val="tx1">
+        <a:lumMod val="65000"/>
+        <a:lumOff val="35000"/>
+      </a:schemeClr>
+    </cs:fontRef>
+    <cs:defRPr sz="1000" kern="1200"/>
+  </cs:axisTitle>
+  <cs:categoryAxis>
+    <cs:lnRef idx="0"/>
+    <cs:fillRef idx="0"/>
+    <cs:effectRef idx="0"/>
+    <cs:fontRef idx="minor">
+      <a:schemeClr val="tx1">
+        <a:lumMod val="65000"/>
+        <a:lumOff val="35000"/>
+      </a:schemeClr>
+    </cs:fontRef>
+    <cs:spPr>
+      <a:ln w="9525" cap="flat" cmpd="sng" algn="ctr">
+        <a:solidFill>
+          <a:schemeClr val="tx1">
+            <a:lumMod val="15000"/>
+            <a:lumOff val="85000"/>
+          </a:schemeClr>
+        </a:solidFill>
+        <a:round/>
+      </a:ln>
+    </cs:spPr>
+    <cs:defRPr sz="900" kern="1200"/>
+  </cs:categoryAxis>
+  <cs:chartArea mods="allowNoFillOverride allowNoLineOverride">
+    <cs:lnRef idx="0"/>
+    <cs:fillRef idx="0"/>
+    <cs:effectRef idx="0"/>
+    <cs:fontRef idx="minor">
+      <a:schemeClr val="tx1"/>
+    </cs:fontRef>
+    <cs:spPr>
+      <a:solidFill>
+        <a:schemeClr val="bg1"/>
+      </a:solidFill>
+      <a:ln w="9525" cap="flat" cmpd="sng" algn="ctr">
+        <a:solidFill>
+          <a:schemeClr val="tx1">
+            <a:lumMod val="15000"/>
+            <a:lumOff val="85000"/>
+          </a:schemeClr>
+        </a:solidFill>
+        <a:round/>
+      </a:ln>
+    </cs:spPr>
+    <cs:defRPr sz="1000" kern="1200"/>
+  </cs:chartArea>
+  <cs:dataLabel>
+    <cs:lnRef idx="0"/>
+    <cs:fillRef idx="0"/>
+    <cs:effectRef idx="0"/>
+    <cs:fontRef idx="minor">
+      <a:schemeClr val="tx1">
+        <a:lumMod val="75000"/>
+        <a:lumOff val="25000"/>
+      </a:schemeClr>
+    </cs:fontRef>
+    <cs:defRPr sz="900" kern="1200"/>
+  </cs:dataLabel>
+  <cs:dataLabelCallout>
+    <cs:lnRef idx="0"/>
+    <cs:fillRef idx="0"/>
+    <cs:effectRef idx="0"/>
+    <cs:fontRef idx="minor">
+      <a:schemeClr val="dk1">
+        <a:lumMod val="65000"/>
+        <a:lumOff val="35000"/>
+      </a:schemeClr>
+    </cs:fontRef>
+    <cs:spPr>
+      <a:solidFill>
+        <a:schemeClr val="lt1"/>
+      </a:solidFill>
+      <a:ln>
+        <a:solidFill>
+          <a:schemeClr val="dk1">
+            <a:lumMod val="25000"/>
+            <a:lumOff val="75000"/>
+          </a:schemeClr>
+        </a:solidFill>
+      </a:ln>
+    </cs:spPr>
+    <cs:defRPr sz="900" kern="1200"/>
+    <cs:bodyPr rot="0" spcFirstLastPara="1" vertOverflow="clip" horzOverflow="clip" vert="horz" wrap="square" lIns="36576" tIns="18288" rIns="36576" bIns="18288" anchor="ctr" anchorCtr="1">
+      <a:spAutoFit/>
+    </cs:bodyPr>
+  </cs:dataLabelCallout>
+  <cs:dataPoint>
+    <cs:lnRef idx="0"/>
+    <cs:fillRef idx="1">
+      <cs:styleClr val="auto"/>
+    </cs:fillRef>
+    <cs:effectRef idx="0"/>
+    <cs:fontRef idx="minor">
+      <a:schemeClr val="tx1"/>
+    </cs:fontRef>
+  </cs:dataPoint>
+  <cs:dataPoint3D>
+    <cs:lnRef idx="0"/>
+    <cs:fillRef idx="1">
+      <cs:styleClr val="auto"/>
+    </cs:fillRef>
+    <cs:effectRef idx="0"/>
+    <cs:fontRef idx="minor">
+      <a:schemeClr val="tx1"/>
+    </cs:fontRef>
+  </cs:dataPoint3D>
+  <cs:dataPointLine>
+    <cs:lnRef idx="0">
+      <cs:styleClr val="auto"/>
+    </cs:lnRef>
+    <cs:fillRef idx="1"/>
+    <cs:effectRef idx="0"/>
+    <cs:fontRef idx="minor">
+      <a:schemeClr val="tx1"/>
+    </cs:fontRef>
+    <cs:spPr>
+      <a:ln w="28575" cap="rnd">
+        <a:solidFill>
+          <a:schemeClr val="phClr"/>
+        </a:solidFill>
+        <a:round/>
+      </a:ln>
+    </cs:spPr>
+  </cs:dataPointLine>
+  <cs:dataPointMarker>
+    <cs:lnRef idx="0">
+      <cs:styleClr val="auto"/>
+    </cs:lnRef>
+    <cs:fillRef idx="1">
+      <cs:styleClr val="auto"/>
+    </cs:fillRef>
+    <cs:effectRef idx="0"/>
+    <cs:fontRef idx="minor">
+      <a:schemeClr val="tx1"/>
+    </cs:fontRef>
+    <cs:spPr>
+      <a:ln w="9525">
+        <a:solidFill>
+          <a:schemeClr val="phClr"/>
+        </a:solidFill>
+      </a:ln>
+    </cs:spPr>
+  </cs:dataPointMarker>
+  <cs:dataPointMarkerLayout symbol="circle" size="5"/>
+  <cs:dataPointWireframe>
+    <cs:lnRef idx="0">
+      <cs:styleClr val="auto"/>
+    </cs:lnRef>
+    <cs:fillRef idx="1"/>
+    <cs:effectRef idx="0"/>
+    <cs:fontRef idx="minor">
+      <a:schemeClr val="tx1"/>
+    </cs:fontRef>
+    <cs:spPr>
+      <a:ln w="9525" cap="rnd">
+        <a:solidFill>
+          <a:schemeClr val="phClr"/>
+        </a:solidFill>
+        <a:round/>
+      </a:ln>
+    </cs:spPr>
+  </cs:dataPointWireframe>
+  <cs:dataTable>
+    <cs:lnRef idx="0"/>
+    <cs:fillRef idx="0"/>
+    <cs:effectRef idx="0"/>
+    <cs:fontRef idx="minor">
+      <a:schemeClr val="tx1">
+        <a:lumMod val="65000"/>
+        <a:lumOff val="35000"/>
+      </a:schemeClr>
+    </cs:fontRef>
+    <cs:spPr>
+      <a:noFill/>
+      <a:ln w="9525" cap="flat" cmpd="sng" algn="ctr">
+        <a:solidFill>
+          <a:schemeClr val="tx1">
+            <a:lumMod val="15000"/>
+            <a:lumOff val="85000"/>
+          </a:schemeClr>
+        </a:solidFill>
+        <a:round/>
+      </a:ln>
+    </cs:spPr>
+    <cs:defRPr sz="900" kern="1200"/>
+  </cs:dataTable>
+  <cs:downBar>
+    <cs:lnRef idx="0"/>
+    <cs:fillRef idx="0"/>
+    <cs:effectRef idx="0"/>
+    <cs:fontRef idx="minor">
+      <a:schemeClr val="tx1"/>
+    </cs:fontRef>
+    <cs:spPr>
+      <a:solidFill>
+        <a:schemeClr val="dk1">
+          <a:lumMod val="75000"/>
+          <a:lumOff val="25000"/>
+        </a:schemeClr>
+      </a:solidFill>
+      <a:ln w="9525" cap="flat" cmpd="sng" algn="ctr">
+        <a:solidFill>
+          <a:schemeClr val="tx1">
+            <a:lumMod val="65000"/>
+            <a:lumOff val="35000"/>
+          </a:schemeClr>
+        </a:solidFill>
+        <a:round/>
+      </a:ln>
+    </cs:spPr>
+  </cs:downBar>
+  <cs:dropLine>
+    <cs:lnRef idx="0"/>
+    <cs:fillRef idx="0"/>
+    <cs:effectRef idx="0"/>
+    <cs:fontRef idx="minor">
+      <a:schemeClr val="tx1"/>
+    </cs:fontRef>
+    <cs:spPr>
+      <a:ln w="9525" cap="flat" cmpd="sng" algn="ctr">
+        <a:solidFill>
+          <a:schemeClr val="tx1">
+            <a:lumMod val="35000"/>
+            <a:lumOff val="65000"/>
+          </a:schemeClr>
+        </a:solidFill>
+        <a:round/>
+      </a:ln>
+    </cs:spPr>
+  </cs:dropLine>
+  <cs:errorBar>
+    <cs:lnRef idx="0"/>
+    <cs:fillRef idx="0"/>
+    <cs:effectRef idx="0"/>
+    <cs:fontRef idx="minor">
+      <a:schemeClr val="tx1"/>
+    </cs:fontRef>
+    <cs:spPr>
+      <a:ln w="9525" cap="flat" cmpd="sng" algn="ctr">
+        <a:solidFill>
+          <a:schemeClr val="tx1">
+            <a:lumMod val="65000"/>
+            <a:lumOff val="35000"/>
+          </a:schemeClr>
+        </a:solidFill>
+        <a:round/>
+      </a:ln>
+    </cs:spPr>
+  </cs:errorBar>
+  <cs:floor>
+    <cs:lnRef idx="0"/>
+    <cs:fillRef idx="0"/>
+    <cs:effectRef idx="0"/>
+    <cs:fontRef idx="minor">
+      <a:schemeClr val="tx1"/>
+    </cs:fontRef>
+    <cs:spPr>
+      <a:noFill/>
+      <a:ln>
+        <a:noFill/>
+      </a:ln>
+    </cs:spPr>
+  </cs:floor>
+  <cs:gridlineMajor>
+    <cs:lnRef idx="0"/>
+    <cs:fillRef idx="0"/>
+    <cs:effectRef idx="0"/>
+    <cs:fontRef idx="minor">
+      <a:schemeClr val="tx1"/>
+    </cs:fontRef>
+    <cs:spPr>
+      <a:ln w="9525" cap="flat" cmpd="sng" algn="ctr">
+        <a:solidFill>
+          <a:schemeClr val="tx1">
+            <a:lumMod val="15000"/>
+            <a:lumOff val="85000"/>
+          </a:schemeClr>
+        </a:solidFill>
+        <a:round/>
+      </a:ln>
+    </cs:spPr>
+  </cs:gridlineMajor>
+  <cs:gridlineMinor>
+    <cs:lnRef idx="0"/>
+    <cs:fillRef idx="0"/>
+    <cs:effectRef idx="0"/>
+    <cs:fontRef idx="minor">
+      <a:schemeClr val="tx1"/>
+    </cs:fontRef>
+    <cs:spPr>
+      <a:ln w="9525" cap="flat" cmpd="sng" algn="ctr">
+        <a:solidFill>
+          <a:schemeClr val="tx1">
+            <a:lumMod val="5000"/>
+            <a:lumOff val="95000"/>
+          </a:schemeClr>
+        </a:solidFill>
+        <a:round/>
+      </a:ln>
+    </cs:spPr>
+  </cs:gridlineMinor>
+  <cs:hiLoLine>
+    <cs:lnRef idx="0"/>
+    <cs:fillRef idx="0"/>
+    <cs:effectRef idx="0"/>
+    <cs:fontRef idx="minor">
+      <a:schemeClr val="tx1"/>
+    </cs:fontRef>
+    <cs:spPr>
+      <a:ln w="9525" cap="flat" cmpd="sng" algn="ctr">
+        <a:solidFill>
+          <a:schemeClr val="tx1">
+            <a:lumMod val="50000"/>
+            <a:lumOff val="50000"/>
+          </a:schemeClr>
+        </a:solidFill>
+        <a:round/>
+      </a:ln>
+    </cs:spPr>
+  </cs:hiLoLine>
+  <cs:leaderLine>
+    <cs:lnRef idx="0"/>
+    <cs:fillRef idx="0"/>
+    <cs:effectRef idx="0"/>
+    <cs:fontRef idx="minor">
+      <a:schemeClr val="tx1"/>
+    </cs:fontRef>
+    <cs:spPr>
+      <a:ln w="9525" cap="flat" cmpd="sng" algn="ctr">
+        <a:solidFill>
+          <a:schemeClr val="tx1">
+            <a:lumMod val="35000"/>
+            <a:lumOff val="65000"/>
+          </a:schemeClr>
+        </a:solidFill>
+        <a:round/>
+      </a:ln>
+    </cs:spPr>
+  </cs:leaderLine>
+  <cs:legend>
+    <cs:lnRef idx="0"/>
+    <cs:fillRef idx="0"/>
+    <cs:effectRef idx="0"/>
+    <cs:fontRef idx="minor">
+      <a:schemeClr val="tx1">
+        <a:lumMod val="65000"/>
+        <a:lumOff val="35000"/>
+      </a:schemeClr>
+    </cs:fontRef>
+    <cs:defRPr sz="900" kern="1200"/>
+  </cs:legend>
+  <cs:plotArea mods="allowNoFillOverride allowNoLineOverride">
+    <cs:lnRef idx="0"/>
+    <cs:fillRef idx="0"/>
+    <cs:effectRef idx="0"/>
+    <cs:fontRef idx="minor">
+      <a:schemeClr val="tx1"/>
+    </cs:fontRef>
+  </cs:plotArea>
+  <cs:plotArea3D mods="allowNoFillOverride allowNoLineOverride">
+    <cs:lnRef idx="0"/>
+    <cs:fillRef idx="0"/>
+    <cs:effectRef idx="0"/>
+    <cs:fontRef idx="minor">
+      <a:schemeClr val="tx1"/>
+    </cs:fontRef>
+  </cs:plotArea3D>
+  <cs:seriesAxis>
+    <cs:lnRef idx="0"/>
+    <cs:fillRef idx="0"/>
+    <cs:effectRef idx="0"/>
+    <cs:fontRef idx="minor">
+      <a:schemeClr val="tx1">
+        <a:lumMod val="65000"/>
+        <a:lumOff val="35000"/>
+      </a:schemeClr>
+    </cs:fontRef>
+    <cs:spPr>
+      <a:ln w="9525" cap="flat" cmpd="sng" algn="ctr">
+        <a:solidFill>
+          <a:schemeClr val="tx1">
+            <a:lumMod val="15000"/>
+            <a:lumOff val="85000"/>
+          </a:schemeClr>
+        </a:solidFill>
+        <a:round/>
+      </a:ln>
+    </cs:spPr>
+    <cs:defRPr sz="900" kern="1200"/>
+  </cs:seriesAxis>
+  <cs:seriesLine>
+    <cs:lnRef idx="0"/>
+    <cs:fillRef idx="0"/>
+    <cs:effectRef idx="0"/>
+    <cs:fontRef idx="minor">
+      <a:schemeClr val="tx1"/>
+    </cs:fontRef>
+    <cs:spPr>
+      <a:ln w="9525" cap="flat" cmpd="sng" algn="ctr">
+        <a:solidFill>
+          <a:schemeClr val="tx1">
+            <a:lumMod val="35000"/>
+            <a:lumOff val="65000"/>
+          </a:schemeClr>
+        </a:solidFill>
+        <a:round/>
+      </a:ln>
+    </cs:spPr>
+  </cs:seriesLine>
+  <cs:title>
+    <cs:lnRef idx="0"/>
+    <cs:fillRef idx="0"/>
+    <cs:effectRef idx="0"/>
+    <cs:fontRef idx="minor">
+      <a:schemeClr val="tx1">
+        <a:lumMod val="65000"/>
+        <a:lumOff val="35000"/>
+      </a:schemeClr>
+    </cs:fontRef>
+    <cs:defRPr sz="1400" b="0" kern="1200" spc="0" baseline="0"/>
+  </cs:title>
+  <cs:trendline>
+    <cs:lnRef idx="0">
+      <cs:styleClr val="auto"/>
+    </cs:lnRef>
+    <cs:fillRef idx="0"/>
+    <cs:effectRef idx="0"/>
+    <cs:fontRef idx="minor">
+      <a:schemeClr val="tx1"/>
+    </cs:fontRef>
+    <cs:spPr>
+      <a:ln w="19050" cap="rnd">
+        <a:solidFill>
+          <a:schemeClr val="phClr"/>
+        </a:solidFill>
+        <a:prstDash val="sysDot"/>
+      </a:ln>
+    </cs:spPr>
+  </cs:trendline>
+  <cs:trendlineLabel>
+    <cs:lnRef idx="0"/>
+    <cs:fillRef idx="0"/>
+    <cs:effectRef idx="0"/>
+    <cs:fontRef idx="minor">
+      <a:schemeClr val="tx1">
+        <a:lumMod val="65000"/>
+        <a:lumOff val="35000"/>
+      </a:schemeClr>
+    </cs:fontRef>
+    <cs:defRPr sz="900" kern="1200"/>
+  </cs:trendlineLabel>
+  <cs:upBar>
+    <cs:lnRef idx="0"/>
+    <cs:fillRef idx="0"/>
+    <cs:effectRef idx="0"/>
+    <cs:fontRef idx="minor">
+      <a:schemeClr val="tx1"/>
+    </cs:fontRef>
+    <cs:spPr>
+      <a:solidFill>
+        <a:schemeClr val="lt1"/>
+      </a:solidFill>
+      <a:ln w="9525" cap="flat" cmpd="sng" algn="ctr">
+        <a:solidFill>
+          <a:schemeClr val="tx1">
+            <a:lumMod val="65000"/>
+            <a:lumOff val="35000"/>
+          </a:schemeClr>
+        </a:solidFill>
+        <a:round/>
+      </a:ln>
+    </cs:spPr>
+  </cs:upBar>
+  <cs:valueAxis>
+    <cs:lnRef idx="0"/>
+    <cs:fillRef idx="0"/>
+    <cs:effectRef idx="0"/>
+    <cs:fontRef idx="minor">
+      <a:schemeClr val="tx1">
+        <a:lumMod val="65000"/>
+        <a:lumOff val="35000"/>
+      </a:schemeClr>
+    </cs:fontRef>
+    <cs:defRPr sz="900" kern="1200"/>
+  </cs:valueAxis>
+  <cs:wall>
+    <cs:lnRef idx="0"/>
+    <cs:fillRef idx="0"/>
+    <cs:effectRef idx="0"/>
+    <cs:fontRef idx="minor">
+      <a:schemeClr val="tx1"/>
+    </cs:fontRef>
+    <cs:spPr>
+      <a:noFill/>
+      <a:ln>
+        <a:noFill/>
+      </a:ln>
+    </cs:spPr>
+  </cs:wall>
+</cs:chartStyle>
 </file>
 
 <file path=word/theme/theme1.xml><?xml version="1.0" encoding="utf-8"?>

</xml_diff>